<commit_message>
Added doc ALU and fix one problem in schematic ALU
</commit_message>
<xml_diff>
--- a/docs/ROM, instruction counter, instruction register.docx
+++ b/docs/ROM, instruction counter, instruction register.docx
@@ -43,6 +43,14 @@
         <w:rPr>
           <w:sz w:val="28"/>
           <w:szCs w:val="28"/>
+        </w:rPr>
+      </w:r>
+      <w:r>
+        <w:rPr>
+          <w:sz w:val="28"/>
+          <w:szCs w:val="28"/>
+          <w:highlight w:val="none"/>
+          <w:lang w:val="en-US"/>
         </w:rPr>
       </w:r>
     </w:p>
@@ -117,6 +125,14 @@
           <w:szCs w:val="28"/>
         </w:rPr>
       </w:r>
+      <w:r>
+        <w:rPr>
+          <w:sz w:val="28"/>
+          <w:szCs w:val="28"/>
+          <w:highlight w:val="none"/>
+          <w:lang w:val="uk-UA"/>
+        </w:rPr>
+      </w:r>
     </w:p>
     <w:p>
       <w:pPr>
@@ -144,6 +160,14 @@
         <w:rPr>
           <w:sz w:val="28"/>
           <w:szCs w:val="28"/>
+        </w:rPr>
+      </w:r>
+      <w:r>
+        <w:rPr>
+          <w:sz w:val="28"/>
+          <w:szCs w:val="28"/>
+          <w:highlight w:val="none"/>
+          <w:lang w:val="uk-UA"/>
         </w:rPr>
       </w:r>
     </w:p>
@@ -190,7 +214,7 @@
                         <pic:nvPr/>
                       </pic:nvPicPr>
                       <pic:blipFill rotWithShape="1">
-                        <a:blip r:embed="rId8"/>
+                        <a:blip r:embed="rId9"/>
                         <a:stretch/>
                       </pic:blipFill>
                       <pic:spPr bwMode="auto">
@@ -230,7 +254,7 @@
                 <o:lock v:ext="edit" aspectratio="t"/>
               </v:shapetype>
               <v:shape id="_x0000_i0" o:spid="_x0000_s0" type="#_x0000_t75" style="width:468.00pt;height:324.13pt;mso-wrap-distance-left:0.00pt;mso-wrap-distance-top:0.00pt;mso-wrap-distance-right:0.00pt;mso-wrap-distance-bottom:0.00pt;z-index:1;" stroked="false">
-                <v:imagedata r:id="rId8" o:title=""/>
+                <v:imagedata r:id="rId9" o:title=""/>
                 <o:lock v:ext="edit" rotation="t"/>
               </v:shape>
             </w:pict>
@@ -241,8 +265,6 @@
         <w:rPr>
           <w:sz w:val="28"/>
           <w:szCs w:val="28"/>
-          <w:highlight w:val="none"/>
-          <w:lang w:val="uk-UA"/>
         </w:rPr>
       </w:r>
       <w:r>
@@ -251,12 +273,6 @@
           <w:szCs w:val="28"/>
           <w:highlight w:val="none"/>
           <w:lang w:val="uk-UA"/>
-        </w:rPr>
-      </w:r>
-      <w:r>
-        <w:rPr>
-          <w:sz w:val="28"/>
-          <w:szCs w:val="28"/>
         </w:rPr>
       </w:r>
     </w:p>
@@ -288,6 +304,14 @@
           <w:szCs w:val="28"/>
         </w:rPr>
       </w:r>
+      <w:r>
+        <w:rPr>
+          <w:sz w:val="28"/>
+          <w:szCs w:val="28"/>
+          <w:highlight w:val="none"/>
+          <w:lang w:val="uk-UA"/>
+        </w:rPr>
+      </w:r>
     </w:p>
     <w:p>
       <w:pPr>
@@ -309,7 +333,16 @@
           <w:highlight w:val="none"/>
           <w:lang w:val="uk-UA"/>
         </w:rPr>
-        <w:t xml:space="preserve">В нижньому лівому куті стоїть те без чого ніяка цифрова електроніка не працює, це генератор тактового сигналу. В більшості процесорів цей генератор є звичайним і за один такт виконується наприклад одна інструкція, але так як мій процесор буде на РТЛ логіці яка сама по собі є доволі повільною відносно інших, тому я рішив розділити одне виконання інструкції на декілька тактів, щоб логічні вентилі встигали переключитись. Тобто наприклад візьмемо інструкцію </w:t>
+        <w:t xml:space="preserve">В нижньому лівому куті стоїть те без чого ніяка цифрова електроніка не працює, це генератор тактового сигналу. В більшості процесорів цей генератор є звичайним і за один такт виконується наприклад одна </w:t>
+      </w:r>
+      <w:r>
+        <w:rPr>
+          <w:sz w:val="28"/>
+          <w:szCs w:val="28"/>
+          <w:highlight w:val="none"/>
+          <w:lang w:val="uk-UA"/>
+        </w:rPr>
+        <w:t xml:space="preserve">інструкція, але так як мій процесор буде на РТЛ логіці яка сама по собі є доволі повільною відносно інших, тому я рішив розділити одне виконання інструкції на декілька тактів, щоб логічні вентилі встигали переключитись. Тобто наприклад візьмемо інструкцію </w:t>
       </w:r>
       <w:r>
         <w:rPr>
@@ -345,12 +378,38 @@
           <w:highlight w:val="none"/>
           <w:lang w:val="uk-UA"/>
         </w:rPr>
-        <w:t xml:space="preserve">, а на четвертий такт результат записується в регістр. І так всі інструкції можна буде виконувати за чотири такти, чотири через те що лічильник стоїть 2-бітний. Деякі інструкції не будуть потребувати чотири такти для їх виконання, тому можна буде скидати лічильник тактів, і за допомогою цього збільшити швидкість процесора, також можна виконувати інструкції на обчислення за три такти об’єднавши обчислення та запис в регістр в один такт, але для цього прискорення потрібні ще транзистори, ну і в мене на меті немає зробити максимально швидкий процесор, а просто робочий, я ще подумаю чи потрібно його прискорювати.</w:t>
+        <w:t xml:space="preserve">, а на четвертий такт результат записується в регістр. І так всі інструкції можна буде виконувати за чот</w:t>
       </w:r>
       <w:r>
         <w:rPr>
           <w:sz w:val="28"/>
           <w:szCs w:val="28"/>
+          <w:highlight w:val="none"/>
+          <w:lang w:val="uk-UA"/>
+        </w:rPr>
+        <w:t xml:space="preserve">ири такти, чотири через те що лічильник стоїть 2-бітний. Деякі інструкції не будуть потребувати чотири такти для їх виконання, тому можна буде скидати лічильник тактів, і за допомогою цього збільшити швидкість процесора, також можна виконувати інструкції н</w:t>
+      </w:r>
+      <w:r>
+        <w:rPr>
+          <w:sz w:val="28"/>
+          <w:szCs w:val="28"/>
+          <w:highlight w:val="none"/>
+          <w:lang w:val="uk-UA"/>
+        </w:rPr>
+        <w:t xml:space="preserve">а обчислення за три такти об’єднавши обчислення та запис в регістр в один такт, але для цього прискорення потрібні ще транзистори, ну і в мене на меті немає зробити максимально швидкий процесор, а просто робочий, я ще подумаю чи потрібно його прискорювати.</w:t>
+      </w:r>
+      <w:r>
+        <w:rPr>
+          <w:sz w:val="28"/>
+          <w:szCs w:val="28"/>
+        </w:rPr>
+      </w:r>
+      <w:r>
+        <w:rPr>
+          <w:sz w:val="28"/>
+          <w:szCs w:val="28"/>
+          <w:highlight w:val="none"/>
+          <w:lang w:val="uk-UA"/>
         </w:rPr>
       </w:r>
     </w:p>
@@ -399,7 +458,62 @@
           <w:highlight w:val="none"/>
           <w:lang w:val="uk-UA"/>
         </w:rPr>
-        <w:t xml:space="preserve">. Це 8-бітний регістр в якого є два режима, це режим лічильника який рахує тактові імпульси, і режим регістра в який записується число з постійної памяті. Ці режими переключаються за допомогою механізму про який трішки потім.</w:t>
+        <w:t xml:space="preserve">. Це 8-бітний регістр в якого є два режима, це режим лічильника який рахує тактові імпульси, і режим регістра в який записується число з постійної пам’яті. Ці режими переключаються за допомогою механізму про який трішки потім.</w:t>
+      </w:r>
+      <w:r>
+        <w:rPr>
+          <w:sz w:val="28"/>
+          <w:szCs w:val="28"/>
+        </w:rPr>
+      </w:r>
+      <w:r>
+        <w:rPr>
+          <w:sz w:val="28"/>
+          <w:szCs w:val="28"/>
+          <w:highlight w:val="none"/>
+          <w:lang w:val="uk-UA"/>
+        </w:rPr>
+      </w:r>
+    </w:p>
+    <w:p>
+      <w:pPr>
+        <w:pBdr/>
+        <w:spacing/>
+        <w:ind/>
+        <w:jc w:val="both"/>
+        <w:rPr>
+          <w:sz w:val="28"/>
+          <w:szCs w:val="28"/>
+          <w:highlight w:val="none"/>
+          <w:lang w:val="uk-UA"/>
+        </w:rPr>
+      </w:pPr>
+      <w:r>
+        <w:rPr>
+          <w:sz w:val="28"/>
+          <w:szCs w:val="28"/>
+          <w:highlight w:val="none"/>
+          <w:lang w:val="uk-UA"/>
+        </w:rPr>
+        <w:t xml:space="preserve">По центрі розташована мікросхема постійної пам’яті. В своєму проекті я буду використовувати мікросхему </w:t>
+      </w:r>
+      <w:r>
+        <w:rPr>
+          <w:sz w:val="28"/>
+          <w:szCs w:val="28"/>
+          <w:highlight w:val="none"/>
+          <w:lang w:val="en-US"/>
+        </w:rPr>
+        <w:t xml:space="preserve">AT28C64</w:t>
+      </w:r>
+      <w:r>
+        <w:rPr>
+          <w:sz w:val="28"/>
+          <w:szCs w:val="28"/>
+          <w:highlight w:val="none"/>
+          <w:lang w:val="uk-UA"/>
+        </w:rPr>
+        <w:t xml:space="preserve">, вона може містити 64кбіт по 8 біт слово. Так як я буду використовувати 8-бітний лічильник то всього процесорі буде доступно 256 інструкцій в пам’яті.</w:t>
       </w:r>
       <w:r>
         <w:rPr>
@@ -417,8 +531,139 @@
         <w:rPr>
           <w:sz w:val="28"/>
           <w:szCs w:val="28"/>
+          <w:highlight w:val="none"/>
+          <w:lang w:val="uk-UA"/>
         </w:rPr>
       </w:pPr>
+      <w:r>
+        <w:rPr>
+          <w:sz w:val="28"/>
+          <w:szCs w:val="28"/>
+          <w:highlight w:val="none"/>
+          <w:lang w:val="uk-UA"/>
+        </w:rPr>
+        <w:t xml:space="preserve">Зверху над пам’яттю розташований регістр інструкцій. Він призначений для зберігання основної інструкції поки не буде повністю виконана команд. Без нього було б не можливо реалізувати команди які виконуються за дві інструкції.</w:t>
+      </w:r>
+      <w:r>
+        <w:rPr>
+          <w:sz w:val="28"/>
+          <w:szCs w:val="28"/>
+        </w:rPr>
+      </w:r>
+    </w:p>
+    <w:p>
+      <w:pPr>
+        <w:pBdr/>
+        <w:spacing/>
+        <w:ind/>
+        <w:jc w:val="both"/>
+        <w:rPr>
+          <w:b w:val="0"/>
+          <w:bCs w:val="0"/>
+          <w:sz w:val="28"/>
+          <w:szCs w:val="28"/>
+          <w:highlight w:val="none"/>
+          <w:lang w:val="uk-UA"/>
+        </w:rPr>
+      </w:pPr>
+      <w:r>
+        <w:rPr>
+          <w:sz w:val="28"/>
+          <w:szCs w:val="28"/>
+          <w:highlight w:val="none"/>
+          <w:lang w:val="uk-UA"/>
+        </w:rPr>
+        <w:t xml:space="preserve">На самому верху стоїть 8</w:t>
+      </w:r>
+      <w:r>
+        <w:rPr>
+          <w:sz w:val="28"/>
+          <w:szCs w:val="28"/>
+          <w:highlight w:val="none"/>
+          <w:lang w:val="en-US"/>
+        </w:rPr>
+        <w:t xml:space="preserve">N</w:t>
+      </w:r>
+      <w:r>
+        <w:rPr>
+          <w:sz w:val="28"/>
+          <w:szCs w:val="28"/>
+          <w:highlight w:val="none"/>
+          <w:lang w:val="en-US"/>
+        </w:rPr>
+        <w:t xml:space="preserve">OR</w:t>
+      </w:r>
+      <w:r>
+        <w:rPr>
+          <w:sz w:val="28"/>
+          <w:szCs w:val="28"/>
+          <w:highlight w:val="none"/>
+          <w:lang w:val="uk-UA"/>
+        </w:rPr>
+        <w:t xml:space="preserve"> який виконує функцію дешифратора в реальному процесорі. Тобто код команди </w:t>
+      </w:r>
+      <w:r>
+        <w:rPr>
+          <w:sz w:val="28"/>
+          <w:szCs w:val="28"/>
+          <w:lang w:val="en-US"/>
+        </w:rPr>
+        <w:t xml:space="preserve">Jump</w:t>
+      </w:r>
+      <w:r>
+        <w:rPr>
+          <w:sz w:val="28"/>
+          <w:szCs w:val="28"/>
+          <w:highlight w:val="none"/>
+          <w:lang w:val="uk-UA"/>
+        </w:rPr>
+        <w:t xml:space="preserve"> це 1101, але тут для того щоб не ставити дешифратор я просто використав </w:t>
+      </w:r>
+      <w:r>
+        <w:rPr>
+          <w:sz w:val="28"/>
+          <w:szCs w:val="28"/>
+          <w:highlight w:val="none"/>
+          <w:lang w:val="en-US"/>
+        </w:rPr>
+        <w:t xml:space="preserve">N</w:t>
+      </w:r>
+      <w:r>
+        <w:rPr>
+          <w:sz w:val="28"/>
+          <w:szCs w:val="28"/>
+          <w:highlight w:val="none"/>
+          <w:lang w:val="en-US"/>
+        </w:rPr>
+        <w:t xml:space="preserve">OR</w:t>
+      </w:r>
+      <w:r>
+        <w:rPr>
+          <w:sz w:val="28"/>
+          <w:szCs w:val="28"/>
+          <w:highlight w:val="none"/>
+          <w:lang w:val="uk-UA"/>
+        </w:rPr>
+        <w:t xml:space="preserve">, і тепер механізм для </w:t>
+      </w:r>
+      <w:r>
+        <w:rPr>
+          <w:b/>
+          <w:bCs/>
+          <w:sz w:val="28"/>
+          <w:szCs w:val="28"/>
+          <w:highlight w:val="none"/>
+          <w:lang w:val="uk-UA"/>
+        </w:rPr>
+      </w:r>
+      <w:r>
+        <w:rPr>
+          <w:sz w:val="28"/>
+          <w:szCs w:val="28"/>
+          <w:lang w:val="en-US"/>
+        </w:rPr>
+        <w:t xml:space="preserve">Jump</w:t>
+      </w:r>
       <w:r>
         <w:rPr>
           <w:sz w:val="28"/>
@@ -430,13 +675,298 @@
       </w:r>
       <w:r>
         <w:rPr>
+          <w:b w:val="0"/>
+          <w:bCs w:val="0"/>
+          <w:sz w:val="28"/>
+          <w:szCs w:val="28"/>
+          <w:highlight w:val="none"/>
+          <w:lang w:val="uk-UA"/>
+        </w:rPr>
+        <w:t xml:space="preserve">включається при інструкції 00000000.</w:t>
+      </w:r>
+      <w:r>
+        <w:rPr>
+          <w:b w:val="0"/>
+          <w:bCs w:val="0"/>
+          <w:sz w:val="28"/>
+          <w:szCs w:val="28"/>
+        </w:rPr>
+      </w:r>
+    </w:p>
+    <w:p>
+      <w:pPr>
+        <w:pBdr/>
+        <w:spacing/>
+        <w:ind/>
+        <w:jc w:val="both"/>
+        <w:rPr>
+          <w:b w:val="0"/>
+          <w:bCs w:val="0"/>
+          <w:sz w:val="28"/>
+          <w:szCs w:val="28"/>
+          <w:highlight w:val="none"/>
+          <w:lang w:val="uk-UA"/>
+        </w:rPr>
+      </w:pPr>
+      <w:r>
+        <w:rPr>
+          <w:b w:val="0"/>
+          <w:bCs w:val="0"/>
+          <w:sz w:val="28"/>
+          <w:szCs w:val="28"/>
+          <w:highlight w:val="none"/>
+          <w:lang w:val="uk-UA"/>
+        </w:rPr>
+        <w:t xml:space="preserve">А тепер про сам механізм для роботи з командами на дві інструкції. Для розуміння як він працює потрібно розписати кроки роботи команди </w:t>
+      </w:r>
+      <w:r>
+        <w:rPr>
+          <w:sz w:val="28"/>
+          <w:szCs w:val="28"/>
+          <w:lang w:val="en-US"/>
+        </w:rPr>
+        <w:t xml:space="preserve">Jump</w:t>
+      </w:r>
+      <w:r>
+        <w:rPr>
+          <w:b w:val="0"/>
+          <w:bCs w:val="0"/>
+          <w:sz w:val="28"/>
+          <w:szCs w:val="28"/>
+          <w:highlight w:val="none"/>
+          <w:lang w:val="uk-UA"/>
+        </w:rPr>
+        <w:t xml:space="preserve">:</w:t>
+      </w:r>
+      <w:r>
+        <w:rPr>
+          <w:b w:val="0"/>
+          <w:bCs w:val="0"/>
+          <w:sz w:val="28"/>
+          <w:szCs w:val="28"/>
+        </w:rPr>
+      </w:r>
+    </w:p>
+    <w:p>
+      <w:pPr>
+        <w:pStyle w:val="890"/>
+        <w:numPr>
+          <w:ilvl w:val="0"/>
+          <w:numId w:val="1"/>
+        </w:numPr>
+        <w:pBdr/>
+        <w:spacing/>
+        <w:ind/>
+        <w:jc w:val="both"/>
+        <w:rPr>
+          <w:b w:val="0"/>
+          <w:bCs w:val="0"/>
+          <w:sz w:val="28"/>
+          <w:szCs w:val="28"/>
+        </w:rPr>
+      </w:pPr>
+      <w:r>
+        <w:rPr>
+          <w:b w:val="0"/>
+          <w:bCs w:val="0"/>
+          <w:sz w:val="28"/>
+          <w:szCs w:val="28"/>
+          <w:highlight w:val="none"/>
+          <w:lang w:val="uk-UA"/>
+        </w:rPr>
+        <w:t xml:space="preserve">Після того як лічильник переключився на інструкцію з командою </w:t>
+      </w:r>
+      <w:r>
+        <w:rPr>
+          <w:sz w:val="28"/>
+          <w:szCs w:val="28"/>
+          <w:lang w:val="en-US"/>
+        </w:rPr>
+        <w:t xml:space="preserve">Jump</w:t>
+      </w:r>
+      <w:r>
+        <w:rPr>
+          <w:b w:val="0"/>
+          <w:bCs w:val="0"/>
+          <w:sz w:val="28"/>
+          <w:szCs w:val="28"/>
+          <w:highlight w:val="none"/>
+          <w:lang w:val="uk-UA"/>
+        </w:rPr>
+        <w:t xml:space="preserve">, вона записується в регістр інструкцій і на далі запис в цей регістр блокується.</w:t>
+      </w:r>
+      <w:r>
+        <w:rPr>
+          <w:b w:val="0"/>
+          <w:bCs w:val="0"/>
+          <w:sz w:val="28"/>
+          <w:szCs w:val="28"/>
+        </w:rPr>
+      </w:r>
+    </w:p>
+    <w:p>
+      <w:pPr>
+        <w:pStyle w:val="890"/>
+        <w:numPr>
+          <w:ilvl w:val="0"/>
+          <w:numId w:val="1"/>
+        </w:numPr>
+        <w:pBdr/>
+        <w:spacing/>
+        <w:ind/>
+        <w:jc w:val="both"/>
+        <w:rPr>
+          <w:b w:val="0"/>
+          <w:bCs w:val="0"/>
+          <w:sz w:val="28"/>
+          <w:szCs w:val="28"/>
+        </w:rPr>
+      </w:pPr>
+      <w:r>
+        <w:rPr>
+          <w:b w:val="0"/>
+          <w:bCs w:val="0"/>
+          <w:sz w:val="28"/>
+          <w:szCs w:val="28"/>
+          <w:highlight w:val="none"/>
+          <w:lang w:val="uk-UA"/>
+        </w:rPr>
+        <w:t xml:space="preserve">Далі тактовий генератор додає один до лічильника інструкцій, і на виході постійної пам’яті появляється інструкція з числом яке має записатись в лічильник.</w:t>
+      </w:r>
+      <w:r>
+        <w:rPr>
+          <w:b w:val="0"/>
+          <w:bCs w:val="0"/>
+          <w:sz w:val="28"/>
+          <w:szCs w:val="28"/>
+        </w:rPr>
+      </w:r>
+    </w:p>
+    <w:p>
+      <w:pPr>
+        <w:pStyle w:val="890"/>
+        <w:numPr>
+          <w:ilvl w:val="0"/>
+          <w:numId w:val="1"/>
+        </w:numPr>
+        <w:pBdr/>
+        <w:spacing/>
+        <w:ind/>
+        <w:jc w:val="both"/>
+        <w:rPr>
+          <w:b w:val="0"/>
+          <w:bCs w:val="0"/>
+          <w:sz w:val="28"/>
+          <w:szCs w:val="28"/>
+        </w:rPr>
+      </w:pPr>
+      <w:r>
+        <w:rPr>
+          <w:b w:val="0"/>
+          <w:bCs w:val="0"/>
+          <w:sz w:val="28"/>
+          <w:szCs w:val="28"/>
+          <w:highlight w:val="none"/>
+          <w:lang w:val="uk-UA"/>
+        </w:rPr>
+        <w:t xml:space="preserve">Потім при наступному такті відкриваються ключі для запису в лічильник, і закриваються ключі для додавання, тобто лічильник переходить в режим регістра. На цьому ж такті відбувається запис числа з пам’яті в лічильник.</w:t>
+      </w:r>
+      <w:r>
+        <w:rPr>
+          <w:b w:val="0"/>
+          <w:bCs w:val="0"/>
+          <w:sz w:val="28"/>
+          <w:szCs w:val="28"/>
+        </w:rPr>
+      </w:r>
+    </w:p>
+    <w:p>
+      <w:pPr>
+        <w:pStyle w:val="890"/>
+        <w:numPr>
+          <w:ilvl w:val="0"/>
+          <w:numId w:val="1"/>
+        </w:numPr>
+        <w:pBdr/>
+        <w:spacing/>
+        <w:ind/>
+        <w:jc w:val="both"/>
+        <w:rPr>
+          <w:b w:val="0"/>
+          <w:bCs w:val="0"/>
+          <w:sz w:val="28"/>
+          <w:szCs w:val="28"/>
+        </w:rPr>
+      </w:pPr>
+      <w:r>
+        <w:rPr>
+          <w:b w:val="0"/>
+          <w:bCs w:val="0"/>
+          <w:sz w:val="28"/>
+          <w:szCs w:val="28"/>
+          <w:highlight w:val="none"/>
+          <w:lang w:val="uk-UA"/>
+        </w:rPr>
+        <w:t xml:space="preserve">Тепер пам’ять переключається на інструкцію за номером який записався в лічильник. Наступний такт закриває ключі на перезапис лічильника і відкриває для додавання, але не додає так як потрібно відпрацювати цю інструкцію за записаним номером.</w:t>
+      </w:r>
+      <w:r>
+        <w:rPr>
+          <w:b w:val="0"/>
+          <w:bCs w:val="0"/>
+          <w:sz w:val="28"/>
+          <w:szCs w:val="28"/>
+        </w:rPr>
+      </w:r>
+    </w:p>
+    <w:p>
+      <w:pPr>
+        <w:pStyle w:val="890"/>
+        <w:numPr>
+          <w:ilvl w:val="0"/>
+          <w:numId w:val="1"/>
+        </w:numPr>
+        <w:pBdr/>
+        <w:spacing/>
+        <w:ind/>
+        <w:jc w:val="both"/>
+        <w:rPr>
+          <w:b w:val="0"/>
+          <w:bCs w:val="0"/>
+          <w:sz w:val="28"/>
+          <w:szCs w:val="28"/>
+        </w:rPr>
+      </w:pPr>
+      <w:r>
+        <w:rPr>
+          <w:b w:val="0"/>
+          <w:bCs w:val="0"/>
+          <w:sz w:val="28"/>
+          <w:szCs w:val="28"/>
+          <w:highlight w:val="none"/>
+          <w:lang w:val="uk-UA"/>
+        </w:rPr>
+        <w:t xml:space="preserve">І останній крок це нова інструкція записується в регістр інструкцій і виконується.</w:t>
+      </w:r>
+      <w:r>
+        <w:rPr>
+          <w:b w:val="0"/>
+          <w:bCs w:val="0"/>
           <w:sz w:val="28"/>
           <w:szCs w:val="28"/>
           <w:highlight w:val="none"/>
           <w:lang w:val="uk-UA"/>
         </w:rPr>
       </w:r>
-      <w:r/>
+      <w:r>
+        <w:rPr>
+          <w:b w:val="0"/>
+          <w:bCs w:val="0"/>
+          <w:sz w:val="28"/>
+          <w:szCs w:val="28"/>
+          <w:highlight w:val="none"/>
+          <w:lang w:val="uk-UA"/>
+        </w:rPr>
+      </w:r>
     </w:p>
     <w:sectPr>
       <w:footnotePr/>
@@ -460,7 +990,6 @@
         <w:ind/>
         <w:rPr/>
       </w:pPr>
-      <w:r/>
       <w:r>
         <w:separator/>
       </w:r>
@@ -475,7 +1004,6 @@
         <w:ind/>
         <w:rPr/>
       </w:pPr>
-      <w:r/>
       <w:r>
         <w:continuationSeparator/>
       </w:r>
@@ -495,7 +1023,6 @@
         <w:ind/>
         <w:rPr/>
       </w:pPr>
-      <w:r/>
       <w:r>
         <w:separator/>
       </w:r>
@@ -510,7 +1037,6 @@
         <w:ind/>
         <w:rPr/>
       </w:pPr>
-      <w:r/>
       <w:r>
         <w:continuationSeparator/>
       </w:r>
@@ -518,6 +1044,143 @@
     </w:p>
   </w:footnote>
 </w:footnotes>
+</file>
+
+<file path=word/numbering.xml><?xml version="1.0" encoding="utf-8"?>
+<w:numbering xmlns:wpc="http://schemas.microsoft.com/office/word/2010/wordprocessingCanvas" xmlns:mc="http://schemas.openxmlformats.org/markup-compatibility/2006" xmlns:o="urn:schemas-microsoft-com:office:office" xmlns:r="http://schemas.openxmlformats.org/officeDocument/2006/relationships" xmlns:m="http://schemas.openxmlformats.org/officeDocument/2006/math" xmlns:v="urn:schemas-microsoft-com:vml" xmlns:wp14="http://schemas.microsoft.com/office/word/2010/wordprocessingDrawing" xmlns:wp="http://schemas.openxmlformats.org/drawingml/2006/wordprocessingDrawing" xmlns:w10="urn:schemas-microsoft-com:office:word" xmlns:w="http://schemas.openxmlformats.org/wordprocessingml/2006/main" xmlns:w14="http://schemas.microsoft.com/office/word/2010/wordml" xmlns:w15="http://schemas.microsoft.com/office/word/2012/wordml" xmlns:wpg="http://schemas.microsoft.com/office/word/2010/wordprocessingGroup" xmlns:wpi="http://schemas.microsoft.com/office/word/2010/wordprocessingInk" xmlns:wne="http://schemas.microsoft.com/office/word/2006/wordml" xmlns:wps="http://schemas.microsoft.com/office/word/2010/wordprocessingShape" mc:Ignorable="w14 w15 wp14">
+  <w:abstractNum w:abstractNumId="0">
+    <w:nsid w:val="6E812957"/>
+    <w:lvl w:ilvl="0">
+      <w:isLgl w:val="false"/>
+      <w:lvlJc w:val="left"/>
+      <w:lvlText w:val="%1."/>
+      <w:numFmt w:val="decimal"/>
+      <w:pPr>
+        <w:pBdr/>
+        <w:spacing/>
+        <w:ind w:hanging="360" w:left="709"/>
+      </w:pPr>
+      <w:rPr/>
+      <w:start w:val="1"/>
+      <w:suff w:val="tab"/>
+    </w:lvl>
+    <w:lvl w:ilvl="1">
+      <w:isLgl w:val="false"/>
+      <w:lvlJc w:val="left"/>
+      <w:lvlText w:val="%2."/>
+      <w:numFmt w:val="lowerLetter"/>
+      <w:pPr>
+        <w:pBdr/>
+        <w:spacing/>
+        <w:ind w:hanging="360" w:left="1429"/>
+      </w:pPr>
+      <w:rPr/>
+      <w:start w:val="1"/>
+      <w:suff w:val="tab"/>
+    </w:lvl>
+    <w:lvl w:ilvl="2">
+      <w:isLgl w:val="false"/>
+      <w:lvlJc w:val="right"/>
+      <w:lvlText w:val="%3."/>
+      <w:numFmt w:val="lowerRoman"/>
+      <w:pPr>
+        <w:pBdr/>
+        <w:spacing/>
+        <w:ind w:hanging="180" w:left="2149"/>
+      </w:pPr>
+      <w:rPr/>
+      <w:start w:val="1"/>
+      <w:suff w:val="tab"/>
+    </w:lvl>
+    <w:lvl w:ilvl="3">
+      <w:isLgl w:val="false"/>
+      <w:lvlJc w:val="left"/>
+      <w:lvlText w:val="%4."/>
+      <w:numFmt w:val="decimal"/>
+      <w:pPr>
+        <w:pBdr/>
+        <w:spacing/>
+        <w:ind w:hanging="360" w:left="2869"/>
+      </w:pPr>
+      <w:rPr/>
+      <w:start w:val="1"/>
+      <w:suff w:val="tab"/>
+    </w:lvl>
+    <w:lvl w:ilvl="4">
+      <w:isLgl w:val="false"/>
+      <w:lvlJc w:val="left"/>
+      <w:lvlText w:val="%5."/>
+      <w:numFmt w:val="lowerLetter"/>
+      <w:pPr>
+        <w:pBdr/>
+        <w:spacing/>
+        <w:ind w:hanging="360" w:left="3589"/>
+      </w:pPr>
+      <w:rPr/>
+      <w:start w:val="1"/>
+      <w:suff w:val="tab"/>
+    </w:lvl>
+    <w:lvl w:ilvl="5">
+      <w:isLgl w:val="false"/>
+      <w:lvlJc w:val="right"/>
+      <w:lvlText w:val="%6."/>
+      <w:numFmt w:val="lowerRoman"/>
+      <w:pPr>
+        <w:pBdr/>
+        <w:spacing/>
+        <w:ind w:hanging="180" w:left="4309"/>
+      </w:pPr>
+      <w:rPr/>
+      <w:start w:val="1"/>
+      <w:suff w:val="tab"/>
+    </w:lvl>
+    <w:lvl w:ilvl="6">
+      <w:isLgl w:val="false"/>
+      <w:lvlJc w:val="left"/>
+      <w:lvlText w:val="%7."/>
+      <w:numFmt w:val="decimal"/>
+      <w:pPr>
+        <w:pBdr/>
+        <w:spacing/>
+        <w:ind w:hanging="360" w:left="5029"/>
+      </w:pPr>
+      <w:rPr/>
+      <w:start w:val="1"/>
+      <w:suff w:val="tab"/>
+    </w:lvl>
+    <w:lvl w:ilvl="7">
+      <w:isLgl w:val="false"/>
+      <w:lvlJc w:val="left"/>
+      <w:lvlText w:val="%8."/>
+      <w:numFmt w:val="lowerLetter"/>
+      <w:pPr>
+        <w:pBdr/>
+        <w:spacing/>
+        <w:ind w:hanging="360" w:left="5749"/>
+      </w:pPr>
+      <w:rPr/>
+      <w:start w:val="1"/>
+      <w:suff w:val="tab"/>
+    </w:lvl>
+    <w:lvl w:ilvl="8">
+      <w:isLgl w:val="false"/>
+      <w:lvlJc w:val="right"/>
+      <w:lvlText w:val="%9."/>
+      <w:numFmt w:val="lowerRoman"/>
+      <w:pPr>
+        <w:pBdr/>
+        <w:spacing/>
+        <w:ind w:hanging="180" w:left="6469"/>
+      </w:pPr>
+      <w:rPr/>
+      <w:start w:val="1"/>
+      <w:suff w:val="tab"/>
+    </w:lvl>
+  </w:abstractNum>
+  <w:num w:numId="1">
+    <w:abstractNumId w:val="0"/>
+  </w:num>
+</w:numbering>
 </file>
 
 <file path=word/styles.xml><?xml version="1.0" encoding="utf-8"?>
@@ -678,9 +1341,9 @@
     <w:lsdException w:name="Bibliography" w:uiPriority="37"/>
     <w:lsdException w:name="TOC Heading" w:uiPriority="39" w:qFormat="1"/>
   </w:latentStyles>
-  <w:style w:type="table" w:styleId="12">
+  <w:style w:type="table" w:styleId="701">
     <w:name w:val="Table Grid"/>
-    <w:basedOn w:val="665"/>
+    <w:basedOn w:val="887"/>
     <w:uiPriority w:val="59"/>
     <w:pPr>
       <w:pBdr/>
@@ -877,9 +1540,9 @@
       </w:tcPr>
     </w:tblStylePr>
   </w:style>
-  <w:style w:type="table" w:styleId="13">
+  <w:style w:type="table" w:styleId="702">
     <w:name w:val="Table Grid Light"/>
-    <w:basedOn w:val="665"/>
+    <w:basedOn w:val="887"/>
     <w:uiPriority w:val="59"/>
     <w:pPr>
       <w:pBdr/>
@@ -1076,9 +1739,9 @@
       </w:tcPr>
     </w:tblStylePr>
   </w:style>
-  <w:style w:type="table" w:styleId="14">
+  <w:style w:type="table" w:styleId="703">
     <w:name w:val="Plain Table 1"/>
-    <w:basedOn w:val="665"/>
+    <w:basedOn w:val="887"/>
     <w:uiPriority w:val="59"/>
     <w:pPr>
       <w:pBdr/>
@@ -1301,9 +1964,9 @@
       </w:tcPr>
     </w:tblStylePr>
   </w:style>
-  <w:style w:type="table" w:styleId="15">
+  <w:style w:type="table" w:styleId="704">
     <w:name w:val="Plain Table 2"/>
-    <w:basedOn w:val="665"/>
+    <w:basedOn w:val="887"/>
     <w:uiPriority w:val="59"/>
     <w:pPr>
       <w:pBdr/>
@@ -1534,9 +2197,9 @@
       </w:tcPr>
     </w:tblStylePr>
   </w:style>
-  <w:style w:type="table" w:styleId="16">
+  <w:style w:type="table" w:styleId="705">
     <w:name w:val="Plain Table 3"/>
-    <w:basedOn w:val="665"/>
+    <w:basedOn w:val="887"/>
     <w:uiPriority w:val="99"/>
     <w:pPr>
       <w:pBdr/>
@@ -1764,9 +2427,9 @@
       </w:tcPr>
     </w:tblStylePr>
   </w:style>
-  <w:style w:type="table" w:styleId="17">
+  <w:style w:type="table" w:styleId="706">
     <w:name w:val="Plain Table 4"/>
-    <w:basedOn w:val="665"/>
+    <w:basedOn w:val="887"/>
     <w:uiPriority w:val="99"/>
     <w:pPr>
       <w:pBdr/>
@@ -1980,9 +2643,9 @@
       </w:tcPr>
     </w:tblStylePr>
   </w:style>
-  <w:style w:type="table" w:styleId="18">
+  <w:style w:type="table" w:styleId="707">
     <w:name w:val="Plain Table 5"/>
-    <w:basedOn w:val="665"/>
+    <w:basedOn w:val="887"/>
     <w:uiPriority w:val="99"/>
     <w:pPr>
       <w:pBdr/>
@@ -2213,9 +2876,9 @@
       </w:tcPr>
     </w:tblStylePr>
   </w:style>
-  <w:style w:type="table" w:styleId="19">
+  <w:style w:type="table" w:styleId="708">
     <w:name w:val="Grid Table 1 Light"/>
-    <w:basedOn w:val="665"/>
+    <w:basedOn w:val="887"/>
     <w:uiPriority w:val="99"/>
     <w:pPr>
       <w:pBdr/>
@@ -2436,9 +3099,9 @@
       </w:tcPr>
     </w:tblStylePr>
   </w:style>
-  <w:style w:type="table" w:styleId="20">
+  <w:style w:type="table" w:styleId="709">
     <w:name w:val="Grid Table 1 Light - Accent 1"/>
-    <w:basedOn w:val="665"/>
+    <w:basedOn w:val="887"/>
     <w:uiPriority w:val="99"/>
     <w:pPr>
       <w:pBdr/>
@@ -2659,9 +3322,9 @@
       </w:tcPr>
     </w:tblStylePr>
   </w:style>
-  <w:style w:type="table" w:styleId="21">
+  <w:style w:type="table" w:styleId="710">
     <w:name w:val="Grid Table 1 Light - Accent 2"/>
-    <w:basedOn w:val="665"/>
+    <w:basedOn w:val="887"/>
     <w:uiPriority w:val="99"/>
     <w:pPr>
       <w:pBdr/>
@@ -2882,9 +3545,9 @@
       </w:tcPr>
     </w:tblStylePr>
   </w:style>
-  <w:style w:type="table" w:styleId="22">
+  <w:style w:type="table" w:styleId="711">
     <w:name w:val="Grid Table 1 Light - Accent 3"/>
-    <w:basedOn w:val="665"/>
+    <w:basedOn w:val="887"/>
     <w:uiPriority w:val="99"/>
     <w:pPr>
       <w:pBdr/>
@@ -3105,9 +3768,9 @@
       </w:tcPr>
     </w:tblStylePr>
   </w:style>
-  <w:style w:type="table" w:styleId="23">
+  <w:style w:type="table" w:styleId="712">
     <w:name w:val="Grid Table 1 Light - Accent 4"/>
-    <w:basedOn w:val="665"/>
+    <w:basedOn w:val="887"/>
     <w:uiPriority w:val="99"/>
     <w:pPr>
       <w:pBdr/>
@@ -3328,9 +3991,9 @@
       </w:tcPr>
     </w:tblStylePr>
   </w:style>
-  <w:style w:type="table" w:styleId="24">
+  <w:style w:type="table" w:styleId="713">
     <w:name w:val="Grid Table 1 Light - Accent 5"/>
-    <w:basedOn w:val="665"/>
+    <w:basedOn w:val="887"/>
     <w:uiPriority w:val="99"/>
     <w:pPr>
       <w:pBdr/>
@@ -3551,9 +4214,9 @@
       </w:tcPr>
     </w:tblStylePr>
   </w:style>
-  <w:style w:type="table" w:styleId="25">
+  <w:style w:type="table" w:styleId="714">
     <w:name w:val="Grid Table 1 Light - Accent 6"/>
-    <w:basedOn w:val="665"/>
+    <w:basedOn w:val="887"/>
     <w:uiPriority w:val="99"/>
     <w:pPr>
       <w:pBdr/>
@@ -3774,9 +4437,9 @@
       </w:tcPr>
     </w:tblStylePr>
   </w:style>
-  <w:style w:type="table" w:styleId="26">
+  <w:style w:type="table" w:styleId="715">
     <w:name w:val="Grid Table 2"/>
-    <w:basedOn w:val="665"/>
+    <w:basedOn w:val="887"/>
     <w:uiPriority w:val="99"/>
     <w:pPr>
       <w:pBdr/>
@@ -4006,9 +4669,9 @@
       </w:tcPr>
     </w:tblStylePr>
   </w:style>
-  <w:style w:type="table" w:styleId="27">
+  <w:style w:type="table" w:styleId="716">
     <w:name w:val="Grid Table 2 - Accent 1"/>
-    <w:basedOn w:val="665"/>
+    <w:basedOn w:val="887"/>
     <w:uiPriority w:val="99"/>
     <w:pPr>
       <w:pBdr/>
@@ -4238,9 +4901,9 @@
       </w:tcPr>
     </w:tblStylePr>
   </w:style>
-  <w:style w:type="table" w:styleId="28">
+  <w:style w:type="table" w:styleId="717">
     <w:name w:val="Grid Table 2 - Accent 2"/>
-    <w:basedOn w:val="665"/>
+    <w:basedOn w:val="887"/>
     <w:uiPriority w:val="99"/>
     <w:pPr>
       <w:pBdr/>
@@ -4470,9 +5133,9 @@
       </w:tcPr>
     </w:tblStylePr>
   </w:style>
-  <w:style w:type="table" w:styleId="29">
+  <w:style w:type="table" w:styleId="718">
     <w:name w:val="Grid Table 2 - Accent 3"/>
-    <w:basedOn w:val="665"/>
+    <w:basedOn w:val="887"/>
     <w:uiPriority w:val="99"/>
     <w:pPr>
       <w:pBdr/>
@@ -4702,9 +5365,9 @@
       </w:tcPr>
     </w:tblStylePr>
   </w:style>
-  <w:style w:type="table" w:styleId="30">
+  <w:style w:type="table" w:styleId="719">
     <w:name w:val="Grid Table 2 - Accent 4"/>
-    <w:basedOn w:val="665"/>
+    <w:basedOn w:val="887"/>
     <w:uiPriority w:val="99"/>
     <w:pPr>
       <w:pBdr/>
@@ -4934,9 +5597,9 @@
       </w:tcPr>
     </w:tblStylePr>
   </w:style>
-  <w:style w:type="table" w:styleId="31">
+  <w:style w:type="table" w:styleId="720">
     <w:name w:val="Grid Table 2 - Accent 5"/>
-    <w:basedOn w:val="665"/>
+    <w:basedOn w:val="887"/>
     <w:uiPriority w:val="99"/>
     <w:pPr>
       <w:pBdr/>
@@ -5166,9 +5829,9 @@
       </w:tcPr>
     </w:tblStylePr>
   </w:style>
-  <w:style w:type="table" w:styleId="32">
+  <w:style w:type="table" w:styleId="721">
     <w:name w:val="Grid Table 2 - Accent 6"/>
-    <w:basedOn w:val="665"/>
+    <w:basedOn w:val="887"/>
     <w:uiPriority w:val="99"/>
     <w:pPr>
       <w:pBdr/>
@@ -5398,9 +6061,9 @@
       </w:tcPr>
     </w:tblStylePr>
   </w:style>
-  <w:style w:type="table" w:styleId="33">
+  <w:style w:type="table" w:styleId="722">
     <w:name w:val="Grid Table 3"/>
-    <w:basedOn w:val="665"/>
+    <w:basedOn w:val="887"/>
     <w:uiPriority w:val="99"/>
     <w:pPr>
       <w:pBdr/>
@@ -5499,29 +6162,6 @@
         <w:tblBorders/>
       </w:tblPr>
       <w:tcPr>
-        <w:shd w:color="ffffff"/>
-        <w:tcBorders>
-          <w:top w:val="none" w:color="000000" w:sz="4" w:space="0"/>
-          <w:left w:val="none" w:color="000000" w:sz="4" w:space="0"/>
-          <w:bottom w:val="none" w:color="000000" w:sz="4" w:space="0"/>
-          <w:right w:val="none" w:color="000000" w:sz="4" w:space="0"/>
-        </w:tcBorders>
-      </w:tcPr>
-    </w:tblStylePr>
-    <w:tblStylePr w:type="firstRow">
-      <w:rPr>
-        <w:b/>
-        <w:color w:val="404040"/>
-      </w:rPr>
-      <w:pPr>
-        <w:pBdr/>
-        <w:spacing/>
-        <w:ind/>
-      </w:pPr>
-      <w:tblPr>
-        <w:tblBorders/>
-      </w:tblPr>
-      <w:tcPr>
         <w:shd w:val="clear" w:color="ffffff"/>
         <w:tcBorders>
           <w:top w:val="none" w:color="000000" w:sz="4" w:space="0"/>
@@ -5531,30 +6171,7 @@
         </w:tcBorders>
       </w:tcPr>
     </w:tblStylePr>
-    <w:tblStylePr w:type="lastCol">
-      <w:rPr>
-        <w:i/>
-        <w:color w:val="404040"/>
-      </w:rPr>
-      <w:pPr>
-        <w:pBdr/>
-        <w:spacing/>
-        <w:ind/>
-      </w:pPr>
-      <w:tblPr>
-        <w:tblBorders/>
-      </w:tblPr>
-      <w:tcPr>
-        <w:shd w:color="ffffff"/>
-        <w:tcBorders>
-          <w:top w:val="none" w:color="000000" w:sz="4" w:space="0"/>
-          <w:left w:val="none" w:color="000000" w:sz="4" w:space="0"/>
-          <w:bottom w:val="none" w:color="000000" w:sz="4" w:space="0"/>
-          <w:right w:val="none" w:color="000000" w:sz="4" w:space="0"/>
-        </w:tcBorders>
-      </w:tcPr>
-    </w:tblStylePr>
-    <w:tblStylePr w:type="lastRow">
+    <w:tblStylePr w:type="firstRow">
       <w:rPr>
         <w:b/>
         <w:color w:val="404040"/>
@@ -5577,6 +6194,52 @@
         </w:tcBorders>
       </w:tcPr>
     </w:tblStylePr>
+    <w:tblStylePr w:type="lastCol">
+      <w:rPr>
+        <w:i/>
+        <w:color w:val="404040"/>
+      </w:rPr>
+      <w:pPr>
+        <w:pBdr/>
+        <w:spacing/>
+        <w:ind/>
+      </w:pPr>
+      <w:tblPr>
+        <w:tblBorders/>
+      </w:tblPr>
+      <w:tcPr>
+        <w:shd w:val="clear" w:color="ffffff"/>
+        <w:tcBorders>
+          <w:top w:val="none" w:color="000000" w:sz="4" w:space="0"/>
+          <w:left w:val="none" w:color="000000" w:sz="4" w:space="0"/>
+          <w:bottom w:val="none" w:color="000000" w:sz="4" w:space="0"/>
+          <w:right w:val="none" w:color="000000" w:sz="4" w:space="0"/>
+        </w:tcBorders>
+      </w:tcPr>
+    </w:tblStylePr>
+    <w:tblStylePr w:type="lastRow">
+      <w:rPr>
+        <w:b/>
+        <w:color w:val="404040"/>
+      </w:rPr>
+      <w:pPr>
+        <w:pBdr/>
+        <w:spacing/>
+        <w:ind/>
+      </w:pPr>
+      <w:tblPr>
+        <w:tblBorders/>
+      </w:tblPr>
+      <w:tcPr>
+        <w:shd w:val="clear" w:color="ffffff"/>
+        <w:tcBorders>
+          <w:top w:val="none" w:color="000000" w:sz="4" w:space="0"/>
+          <w:left w:val="none" w:color="000000" w:sz="4" w:space="0"/>
+          <w:bottom w:val="none" w:color="000000" w:sz="4" w:space="0"/>
+          <w:right w:val="none" w:color="000000" w:sz="4" w:space="0"/>
+        </w:tcBorders>
+      </w:tcPr>
+    </w:tblStylePr>
     <w:tblStylePr w:type="nwCell">
       <w:pPr>
         <w:pBdr/>
@@ -5643,9 +6306,9 @@
       </w:tcPr>
     </w:tblStylePr>
   </w:style>
-  <w:style w:type="table" w:styleId="34">
+  <w:style w:type="table" w:styleId="723">
     <w:name w:val="Grid Table 3 - Accent 1"/>
-    <w:basedOn w:val="665"/>
+    <w:basedOn w:val="887"/>
     <w:uiPriority w:val="99"/>
     <w:pPr>
       <w:pBdr/>
@@ -5744,29 +6407,6 @@
         <w:tblBorders/>
       </w:tblPr>
       <w:tcPr>
-        <w:shd w:color="ffffff"/>
-        <w:tcBorders>
-          <w:top w:val="none" w:color="000000" w:sz="4" w:space="0"/>
-          <w:left w:val="none" w:color="000000" w:sz="4" w:space="0"/>
-          <w:bottom w:val="none" w:color="000000" w:sz="4" w:space="0"/>
-          <w:right w:val="none" w:color="000000" w:sz="4" w:space="0"/>
-        </w:tcBorders>
-      </w:tcPr>
-    </w:tblStylePr>
-    <w:tblStylePr w:type="firstRow">
-      <w:rPr>
-        <w:b/>
-        <w:color w:val="404040"/>
-      </w:rPr>
-      <w:pPr>
-        <w:pBdr/>
-        <w:spacing/>
-        <w:ind/>
-      </w:pPr>
-      <w:tblPr>
-        <w:tblBorders/>
-      </w:tblPr>
-      <w:tcPr>
         <w:shd w:val="clear" w:color="ffffff"/>
         <w:tcBorders>
           <w:top w:val="none" w:color="000000" w:sz="4" w:space="0"/>
@@ -5776,30 +6416,7 @@
         </w:tcBorders>
       </w:tcPr>
     </w:tblStylePr>
-    <w:tblStylePr w:type="lastCol">
-      <w:rPr>
-        <w:i/>
-        <w:color w:val="404040"/>
-      </w:rPr>
-      <w:pPr>
-        <w:pBdr/>
-        <w:spacing/>
-        <w:ind/>
-      </w:pPr>
-      <w:tblPr>
-        <w:tblBorders/>
-      </w:tblPr>
-      <w:tcPr>
-        <w:shd w:color="ffffff"/>
-        <w:tcBorders>
-          <w:top w:val="none" w:color="000000" w:sz="4" w:space="0"/>
-          <w:left w:val="none" w:color="000000" w:sz="4" w:space="0"/>
-          <w:bottom w:val="none" w:color="000000" w:sz="4" w:space="0"/>
-          <w:right w:val="none" w:color="000000" w:sz="4" w:space="0"/>
-        </w:tcBorders>
-      </w:tcPr>
-    </w:tblStylePr>
-    <w:tblStylePr w:type="lastRow">
+    <w:tblStylePr w:type="firstRow">
       <w:rPr>
         <w:b/>
         <w:color w:val="404040"/>
@@ -5822,6 +6439,52 @@
         </w:tcBorders>
       </w:tcPr>
     </w:tblStylePr>
+    <w:tblStylePr w:type="lastCol">
+      <w:rPr>
+        <w:i/>
+        <w:color w:val="404040"/>
+      </w:rPr>
+      <w:pPr>
+        <w:pBdr/>
+        <w:spacing/>
+        <w:ind/>
+      </w:pPr>
+      <w:tblPr>
+        <w:tblBorders/>
+      </w:tblPr>
+      <w:tcPr>
+        <w:shd w:val="clear" w:color="ffffff"/>
+        <w:tcBorders>
+          <w:top w:val="none" w:color="000000" w:sz="4" w:space="0"/>
+          <w:left w:val="none" w:color="000000" w:sz="4" w:space="0"/>
+          <w:bottom w:val="none" w:color="000000" w:sz="4" w:space="0"/>
+          <w:right w:val="none" w:color="000000" w:sz="4" w:space="0"/>
+        </w:tcBorders>
+      </w:tcPr>
+    </w:tblStylePr>
+    <w:tblStylePr w:type="lastRow">
+      <w:rPr>
+        <w:b/>
+        <w:color w:val="404040"/>
+      </w:rPr>
+      <w:pPr>
+        <w:pBdr/>
+        <w:spacing/>
+        <w:ind/>
+      </w:pPr>
+      <w:tblPr>
+        <w:tblBorders/>
+      </w:tblPr>
+      <w:tcPr>
+        <w:shd w:val="clear" w:color="ffffff"/>
+        <w:tcBorders>
+          <w:top w:val="none" w:color="000000" w:sz="4" w:space="0"/>
+          <w:left w:val="none" w:color="000000" w:sz="4" w:space="0"/>
+          <w:bottom w:val="none" w:color="000000" w:sz="4" w:space="0"/>
+          <w:right w:val="none" w:color="000000" w:sz="4" w:space="0"/>
+        </w:tcBorders>
+      </w:tcPr>
+    </w:tblStylePr>
     <w:tblStylePr w:type="nwCell">
       <w:pPr>
         <w:pBdr/>
@@ -5888,9 +6551,9 @@
       </w:tcPr>
     </w:tblStylePr>
   </w:style>
-  <w:style w:type="table" w:styleId="35">
+  <w:style w:type="table" w:styleId="724">
     <w:name w:val="Grid Table 3 - Accent 2"/>
-    <w:basedOn w:val="665"/>
+    <w:basedOn w:val="887"/>
     <w:uiPriority w:val="99"/>
     <w:pPr>
       <w:pBdr/>
@@ -5989,29 +6652,6 @@
         <w:tblBorders/>
       </w:tblPr>
       <w:tcPr>
-        <w:shd w:color="ffffff"/>
-        <w:tcBorders>
-          <w:top w:val="none" w:color="000000" w:sz="4" w:space="0"/>
-          <w:left w:val="none" w:color="000000" w:sz="4" w:space="0"/>
-          <w:bottom w:val="none" w:color="000000" w:sz="4" w:space="0"/>
-          <w:right w:val="none" w:color="000000" w:sz="4" w:space="0"/>
-        </w:tcBorders>
-      </w:tcPr>
-    </w:tblStylePr>
-    <w:tblStylePr w:type="firstRow">
-      <w:rPr>
-        <w:b/>
-        <w:color w:val="404040"/>
-      </w:rPr>
-      <w:pPr>
-        <w:pBdr/>
-        <w:spacing/>
-        <w:ind/>
-      </w:pPr>
-      <w:tblPr>
-        <w:tblBorders/>
-      </w:tblPr>
-      <w:tcPr>
         <w:shd w:val="clear" w:color="ffffff"/>
         <w:tcBorders>
           <w:top w:val="none" w:color="000000" w:sz="4" w:space="0"/>
@@ -6021,30 +6661,7 @@
         </w:tcBorders>
       </w:tcPr>
     </w:tblStylePr>
-    <w:tblStylePr w:type="lastCol">
-      <w:rPr>
-        <w:i/>
-        <w:color w:val="404040"/>
-      </w:rPr>
-      <w:pPr>
-        <w:pBdr/>
-        <w:spacing/>
-        <w:ind/>
-      </w:pPr>
-      <w:tblPr>
-        <w:tblBorders/>
-      </w:tblPr>
-      <w:tcPr>
-        <w:shd w:color="ffffff"/>
-        <w:tcBorders>
-          <w:top w:val="none" w:color="000000" w:sz="4" w:space="0"/>
-          <w:left w:val="none" w:color="000000" w:sz="4" w:space="0"/>
-          <w:bottom w:val="none" w:color="000000" w:sz="4" w:space="0"/>
-          <w:right w:val="none" w:color="000000" w:sz="4" w:space="0"/>
-        </w:tcBorders>
-      </w:tcPr>
-    </w:tblStylePr>
-    <w:tblStylePr w:type="lastRow">
+    <w:tblStylePr w:type="firstRow">
       <w:rPr>
         <w:b/>
         <w:color w:val="404040"/>
@@ -6067,6 +6684,52 @@
         </w:tcBorders>
       </w:tcPr>
     </w:tblStylePr>
+    <w:tblStylePr w:type="lastCol">
+      <w:rPr>
+        <w:i/>
+        <w:color w:val="404040"/>
+      </w:rPr>
+      <w:pPr>
+        <w:pBdr/>
+        <w:spacing/>
+        <w:ind/>
+      </w:pPr>
+      <w:tblPr>
+        <w:tblBorders/>
+      </w:tblPr>
+      <w:tcPr>
+        <w:shd w:val="clear" w:color="ffffff"/>
+        <w:tcBorders>
+          <w:top w:val="none" w:color="000000" w:sz="4" w:space="0"/>
+          <w:left w:val="none" w:color="000000" w:sz="4" w:space="0"/>
+          <w:bottom w:val="none" w:color="000000" w:sz="4" w:space="0"/>
+          <w:right w:val="none" w:color="000000" w:sz="4" w:space="0"/>
+        </w:tcBorders>
+      </w:tcPr>
+    </w:tblStylePr>
+    <w:tblStylePr w:type="lastRow">
+      <w:rPr>
+        <w:b/>
+        <w:color w:val="404040"/>
+      </w:rPr>
+      <w:pPr>
+        <w:pBdr/>
+        <w:spacing/>
+        <w:ind/>
+      </w:pPr>
+      <w:tblPr>
+        <w:tblBorders/>
+      </w:tblPr>
+      <w:tcPr>
+        <w:shd w:val="clear" w:color="ffffff"/>
+        <w:tcBorders>
+          <w:top w:val="none" w:color="000000" w:sz="4" w:space="0"/>
+          <w:left w:val="none" w:color="000000" w:sz="4" w:space="0"/>
+          <w:bottom w:val="none" w:color="000000" w:sz="4" w:space="0"/>
+          <w:right w:val="none" w:color="000000" w:sz="4" w:space="0"/>
+        </w:tcBorders>
+      </w:tcPr>
+    </w:tblStylePr>
     <w:tblStylePr w:type="nwCell">
       <w:pPr>
         <w:pBdr/>
@@ -6133,9 +6796,9 @@
       </w:tcPr>
     </w:tblStylePr>
   </w:style>
-  <w:style w:type="table" w:styleId="36">
+  <w:style w:type="table" w:styleId="725">
     <w:name w:val="Grid Table 3 - Accent 3"/>
-    <w:basedOn w:val="665"/>
+    <w:basedOn w:val="887"/>
     <w:uiPriority w:val="99"/>
     <w:pPr>
       <w:pBdr/>
@@ -6234,29 +6897,6 @@
         <w:tblBorders/>
       </w:tblPr>
       <w:tcPr>
-        <w:shd w:color="ffffff"/>
-        <w:tcBorders>
-          <w:top w:val="none" w:color="000000" w:sz="4" w:space="0"/>
-          <w:left w:val="none" w:color="000000" w:sz="4" w:space="0"/>
-          <w:bottom w:val="none" w:color="000000" w:sz="4" w:space="0"/>
-          <w:right w:val="none" w:color="000000" w:sz="4" w:space="0"/>
-        </w:tcBorders>
-      </w:tcPr>
-    </w:tblStylePr>
-    <w:tblStylePr w:type="firstRow">
-      <w:rPr>
-        <w:b/>
-        <w:color w:val="404040"/>
-      </w:rPr>
-      <w:pPr>
-        <w:pBdr/>
-        <w:spacing/>
-        <w:ind/>
-      </w:pPr>
-      <w:tblPr>
-        <w:tblBorders/>
-      </w:tblPr>
-      <w:tcPr>
         <w:shd w:val="clear" w:color="ffffff"/>
         <w:tcBorders>
           <w:top w:val="none" w:color="000000" w:sz="4" w:space="0"/>
@@ -6266,30 +6906,7 @@
         </w:tcBorders>
       </w:tcPr>
     </w:tblStylePr>
-    <w:tblStylePr w:type="lastCol">
-      <w:rPr>
-        <w:i/>
-        <w:color w:val="404040"/>
-      </w:rPr>
-      <w:pPr>
-        <w:pBdr/>
-        <w:spacing/>
-        <w:ind/>
-      </w:pPr>
-      <w:tblPr>
-        <w:tblBorders/>
-      </w:tblPr>
-      <w:tcPr>
-        <w:shd w:color="ffffff"/>
-        <w:tcBorders>
-          <w:top w:val="none" w:color="000000" w:sz="4" w:space="0"/>
-          <w:left w:val="none" w:color="000000" w:sz="4" w:space="0"/>
-          <w:bottom w:val="none" w:color="000000" w:sz="4" w:space="0"/>
-          <w:right w:val="none" w:color="000000" w:sz="4" w:space="0"/>
-        </w:tcBorders>
-      </w:tcPr>
-    </w:tblStylePr>
-    <w:tblStylePr w:type="lastRow">
+    <w:tblStylePr w:type="firstRow">
       <w:rPr>
         <w:b/>
         <w:color w:val="404040"/>
@@ -6312,6 +6929,52 @@
         </w:tcBorders>
       </w:tcPr>
     </w:tblStylePr>
+    <w:tblStylePr w:type="lastCol">
+      <w:rPr>
+        <w:i/>
+        <w:color w:val="404040"/>
+      </w:rPr>
+      <w:pPr>
+        <w:pBdr/>
+        <w:spacing/>
+        <w:ind/>
+      </w:pPr>
+      <w:tblPr>
+        <w:tblBorders/>
+      </w:tblPr>
+      <w:tcPr>
+        <w:shd w:val="clear" w:color="ffffff"/>
+        <w:tcBorders>
+          <w:top w:val="none" w:color="000000" w:sz="4" w:space="0"/>
+          <w:left w:val="none" w:color="000000" w:sz="4" w:space="0"/>
+          <w:bottom w:val="none" w:color="000000" w:sz="4" w:space="0"/>
+          <w:right w:val="none" w:color="000000" w:sz="4" w:space="0"/>
+        </w:tcBorders>
+      </w:tcPr>
+    </w:tblStylePr>
+    <w:tblStylePr w:type="lastRow">
+      <w:rPr>
+        <w:b/>
+        <w:color w:val="404040"/>
+      </w:rPr>
+      <w:pPr>
+        <w:pBdr/>
+        <w:spacing/>
+        <w:ind/>
+      </w:pPr>
+      <w:tblPr>
+        <w:tblBorders/>
+      </w:tblPr>
+      <w:tcPr>
+        <w:shd w:val="clear" w:color="ffffff"/>
+        <w:tcBorders>
+          <w:top w:val="none" w:color="000000" w:sz="4" w:space="0"/>
+          <w:left w:val="none" w:color="000000" w:sz="4" w:space="0"/>
+          <w:bottom w:val="none" w:color="000000" w:sz="4" w:space="0"/>
+          <w:right w:val="none" w:color="000000" w:sz="4" w:space="0"/>
+        </w:tcBorders>
+      </w:tcPr>
+    </w:tblStylePr>
     <w:tblStylePr w:type="nwCell">
       <w:pPr>
         <w:pBdr/>
@@ -6378,9 +7041,9 @@
       </w:tcPr>
     </w:tblStylePr>
   </w:style>
-  <w:style w:type="table" w:styleId="37">
+  <w:style w:type="table" w:styleId="726">
     <w:name w:val="Grid Table 3 - Accent 4"/>
-    <w:basedOn w:val="665"/>
+    <w:basedOn w:val="887"/>
     <w:uiPriority w:val="99"/>
     <w:pPr>
       <w:pBdr/>
@@ -6479,29 +7142,6 @@
         <w:tblBorders/>
       </w:tblPr>
       <w:tcPr>
-        <w:shd w:color="ffffff"/>
-        <w:tcBorders>
-          <w:top w:val="none" w:color="000000" w:sz="4" w:space="0"/>
-          <w:left w:val="none" w:color="000000" w:sz="4" w:space="0"/>
-          <w:bottom w:val="none" w:color="000000" w:sz="4" w:space="0"/>
-          <w:right w:val="none" w:color="000000" w:sz="4" w:space="0"/>
-        </w:tcBorders>
-      </w:tcPr>
-    </w:tblStylePr>
-    <w:tblStylePr w:type="firstRow">
-      <w:rPr>
-        <w:b/>
-        <w:color w:val="404040"/>
-      </w:rPr>
-      <w:pPr>
-        <w:pBdr/>
-        <w:spacing/>
-        <w:ind/>
-      </w:pPr>
-      <w:tblPr>
-        <w:tblBorders/>
-      </w:tblPr>
-      <w:tcPr>
         <w:shd w:val="clear" w:color="ffffff"/>
         <w:tcBorders>
           <w:top w:val="none" w:color="000000" w:sz="4" w:space="0"/>
@@ -6511,30 +7151,7 @@
         </w:tcBorders>
       </w:tcPr>
     </w:tblStylePr>
-    <w:tblStylePr w:type="lastCol">
-      <w:rPr>
-        <w:i/>
-        <w:color w:val="404040"/>
-      </w:rPr>
-      <w:pPr>
-        <w:pBdr/>
-        <w:spacing/>
-        <w:ind/>
-      </w:pPr>
-      <w:tblPr>
-        <w:tblBorders/>
-      </w:tblPr>
-      <w:tcPr>
-        <w:shd w:color="ffffff"/>
-        <w:tcBorders>
-          <w:top w:val="none" w:color="000000" w:sz="4" w:space="0"/>
-          <w:left w:val="none" w:color="000000" w:sz="4" w:space="0"/>
-          <w:bottom w:val="none" w:color="000000" w:sz="4" w:space="0"/>
-          <w:right w:val="none" w:color="000000" w:sz="4" w:space="0"/>
-        </w:tcBorders>
-      </w:tcPr>
-    </w:tblStylePr>
-    <w:tblStylePr w:type="lastRow">
+    <w:tblStylePr w:type="firstRow">
       <w:rPr>
         <w:b/>
         <w:color w:val="404040"/>
@@ -6557,6 +7174,52 @@
         </w:tcBorders>
       </w:tcPr>
     </w:tblStylePr>
+    <w:tblStylePr w:type="lastCol">
+      <w:rPr>
+        <w:i/>
+        <w:color w:val="404040"/>
+      </w:rPr>
+      <w:pPr>
+        <w:pBdr/>
+        <w:spacing/>
+        <w:ind/>
+      </w:pPr>
+      <w:tblPr>
+        <w:tblBorders/>
+      </w:tblPr>
+      <w:tcPr>
+        <w:shd w:val="clear" w:color="ffffff"/>
+        <w:tcBorders>
+          <w:top w:val="none" w:color="000000" w:sz="4" w:space="0"/>
+          <w:left w:val="none" w:color="000000" w:sz="4" w:space="0"/>
+          <w:bottom w:val="none" w:color="000000" w:sz="4" w:space="0"/>
+          <w:right w:val="none" w:color="000000" w:sz="4" w:space="0"/>
+        </w:tcBorders>
+      </w:tcPr>
+    </w:tblStylePr>
+    <w:tblStylePr w:type="lastRow">
+      <w:rPr>
+        <w:b/>
+        <w:color w:val="404040"/>
+      </w:rPr>
+      <w:pPr>
+        <w:pBdr/>
+        <w:spacing/>
+        <w:ind/>
+      </w:pPr>
+      <w:tblPr>
+        <w:tblBorders/>
+      </w:tblPr>
+      <w:tcPr>
+        <w:shd w:val="clear" w:color="ffffff"/>
+        <w:tcBorders>
+          <w:top w:val="none" w:color="000000" w:sz="4" w:space="0"/>
+          <w:left w:val="none" w:color="000000" w:sz="4" w:space="0"/>
+          <w:bottom w:val="none" w:color="000000" w:sz="4" w:space="0"/>
+          <w:right w:val="none" w:color="000000" w:sz="4" w:space="0"/>
+        </w:tcBorders>
+      </w:tcPr>
+    </w:tblStylePr>
     <w:tblStylePr w:type="nwCell">
       <w:pPr>
         <w:pBdr/>
@@ -6623,9 +7286,9 @@
       </w:tcPr>
     </w:tblStylePr>
   </w:style>
-  <w:style w:type="table" w:styleId="38">
+  <w:style w:type="table" w:styleId="727">
     <w:name w:val="Grid Table 3 - Accent 5"/>
-    <w:basedOn w:val="665"/>
+    <w:basedOn w:val="887"/>
     <w:uiPriority w:val="99"/>
     <w:pPr>
       <w:pBdr/>
@@ -6724,29 +7387,6 @@
         <w:tblBorders/>
       </w:tblPr>
       <w:tcPr>
-        <w:shd w:color="ffffff"/>
-        <w:tcBorders>
-          <w:top w:val="none" w:color="000000" w:sz="4" w:space="0"/>
-          <w:left w:val="none" w:color="000000" w:sz="4" w:space="0"/>
-          <w:bottom w:val="none" w:color="000000" w:sz="4" w:space="0"/>
-          <w:right w:val="none" w:color="000000" w:sz="4" w:space="0"/>
-        </w:tcBorders>
-      </w:tcPr>
-    </w:tblStylePr>
-    <w:tblStylePr w:type="firstRow">
-      <w:rPr>
-        <w:b/>
-        <w:color w:val="404040"/>
-      </w:rPr>
-      <w:pPr>
-        <w:pBdr/>
-        <w:spacing/>
-        <w:ind/>
-      </w:pPr>
-      <w:tblPr>
-        <w:tblBorders/>
-      </w:tblPr>
-      <w:tcPr>
         <w:shd w:val="clear" w:color="ffffff"/>
         <w:tcBorders>
           <w:top w:val="none" w:color="000000" w:sz="4" w:space="0"/>
@@ -6756,30 +7396,7 @@
         </w:tcBorders>
       </w:tcPr>
     </w:tblStylePr>
-    <w:tblStylePr w:type="lastCol">
-      <w:rPr>
-        <w:i/>
-        <w:color w:val="404040"/>
-      </w:rPr>
-      <w:pPr>
-        <w:pBdr/>
-        <w:spacing/>
-        <w:ind/>
-      </w:pPr>
-      <w:tblPr>
-        <w:tblBorders/>
-      </w:tblPr>
-      <w:tcPr>
-        <w:shd w:color="ffffff"/>
-        <w:tcBorders>
-          <w:top w:val="none" w:color="000000" w:sz="4" w:space="0"/>
-          <w:left w:val="none" w:color="000000" w:sz="4" w:space="0"/>
-          <w:bottom w:val="none" w:color="000000" w:sz="4" w:space="0"/>
-          <w:right w:val="none" w:color="000000" w:sz="4" w:space="0"/>
-        </w:tcBorders>
-      </w:tcPr>
-    </w:tblStylePr>
-    <w:tblStylePr w:type="lastRow">
+    <w:tblStylePr w:type="firstRow">
       <w:rPr>
         <w:b/>
         <w:color w:val="404040"/>
@@ -6802,6 +7419,52 @@
         </w:tcBorders>
       </w:tcPr>
     </w:tblStylePr>
+    <w:tblStylePr w:type="lastCol">
+      <w:rPr>
+        <w:i/>
+        <w:color w:val="404040"/>
+      </w:rPr>
+      <w:pPr>
+        <w:pBdr/>
+        <w:spacing/>
+        <w:ind/>
+      </w:pPr>
+      <w:tblPr>
+        <w:tblBorders/>
+      </w:tblPr>
+      <w:tcPr>
+        <w:shd w:val="clear" w:color="ffffff"/>
+        <w:tcBorders>
+          <w:top w:val="none" w:color="000000" w:sz="4" w:space="0"/>
+          <w:left w:val="none" w:color="000000" w:sz="4" w:space="0"/>
+          <w:bottom w:val="none" w:color="000000" w:sz="4" w:space="0"/>
+          <w:right w:val="none" w:color="000000" w:sz="4" w:space="0"/>
+        </w:tcBorders>
+      </w:tcPr>
+    </w:tblStylePr>
+    <w:tblStylePr w:type="lastRow">
+      <w:rPr>
+        <w:b/>
+        <w:color w:val="404040"/>
+      </w:rPr>
+      <w:pPr>
+        <w:pBdr/>
+        <w:spacing/>
+        <w:ind/>
+      </w:pPr>
+      <w:tblPr>
+        <w:tblBorders/>
+      </w:tblPr>
+      <w:tcPr>
+        <w:shd w:val="clear" w:color="ffffff"/>
+        <w:tcBorders>
+          <w:top w:val="none" w:color="000000" w:sz="4" w:space="0"/>
+          <w:left w:val="none" w:color="000000" w:sz="4" w:space="0"/>
+          <w:bottom w:val="none" w:color="000000" w:sz="4" w:space="0"/>
+          <w:right w:val="none" w:color="000000" w:sz="4" w:space="0"/>
+        </w:tcBorders>
+      </w:tcPr>
+    </w:tblStylePr>
     <w:tblStylePr w:type="nwCell">
       <w:pPr>
         <w:pBdr/>
@@ -6868,9 +7531,9 @@
       </w:tcPr>
     </w:tblStylePr>
   </w:style>
-  <w:style w:type="table" w:styleId="39">
+  <w:style w:type="table" w:styleId="728">
     <w:name w:val="Grid Table 3 - Accent 6"/>
-    <w:basedOn w:val="665"/>
+    <w:basedOn w:val="887"/>
     <w:uiPriority w:val="99"/>
     <w:pPr>
       <w:pBdr/>
@@ -6969,29 +7632,6 @@
         <w:tblBorders/>
       </w:tblPr>
       <w:tcPr>
-        <w:shd w:color="ffffff"/>
-        <w:tcBorders>
-          <w:top w:val="none" w:color="000000" w:sz="4" w:space="0"/>
-          <w:left w:val="none" w:color="000000" w:sz="4" w:space="0"/>
-          <w:bottom w:val="none" w:color="000000" w:sz="4" w:space="0"/>
-          <w:right w:val="none" w:color="000000" w:sz="4" w:space="0"/>
-        </w:tcBorders>
-      </w:tcPr>
-    </w:tblStylePr>
-    <w:tblStylePr w:type="firstRow">
-      <w:rPr>
-        <w:b/>
-        <w:color w:val="404040"/>
-      </w:rPr>
-      <w:pPr>
-        <w:pBdr/>
-        <w:spacing/>
-        <w:ind/>
-      </w:pPr>
-      <w:tblPr>
-        <w:tblBorders/>
-      </w:tblPr>
-      <w:tcPr>
         <w:shd w:val="clear" w:color="ffffff"/>
         <w:tcBorders>
           <w:top w:val="none" w:color="000000" w:sz="4" w:space="0"/>
@@ -7001,30 +7641,7 @@
         </w:tcBorders>
       </w:tcPr>
     </w:tblStylePr>
-    <w:tblStylePr w:type="lastCol">
-      <w:rPr>
-        <w:i/>
-        <w:color w:val="404040"/>
-      </w:rPr>
-      <w:pPr>
-        <w:pBdr/>
-        <w:spacing/>
-        <w:ind/>
-      </w:pPr>
-      <w:tblPr>
-        <w:tblBorders/>
-      </w:tblPr>
-      <w:tcPr>
-        <w:shd w:color="ffffff"/>
-        <w:tcBorders>
-          <w:top w:val="none" w:color="000000" w:sz="4" w:space="0"/>
-          <w:left w:val="none" w:color="000000" w:sz="4" w:space="0"/>
-          <w:bottom w:val="none" w:color="000000" w:sz="4" w:space="0"/>
-          <w:right w:val="none" w:color="000000" w:sz="4" w:space="0"/>
-        </w:tcBorders>
-      </w:tcPr>
-    </w:tblStylePr>
-    <w:tblStylePr w:type="lastRow">
+    <w:tblStylePr w:type="firstRow">
       <w:rPr>
         <w:b/>
         <w:color w:val="404040"/>
@@ -7047,6 +7664,52 @@
         </w:tcBorders>
       </w:tcPr>
     </w:tblStylePr>
+    <w:tblStylePr w:type="lastCol">
+      <w:rPr>
+        <w:i/>
+        <w:color w:val="404040"/>
+      </w:rPr>
+      <w:pPr>
+        <w:pBdr/>
+        <w:spacing/>
+        <w:ind/>
+      </w:pPr>
+      <w:tblPr>
+        <w:tblBorders/>
+      </w:tblPr>
+      <w:tcPr>
+        <w:shd w:val="clear" w:color="ffffff"/>
+        <w:tcBorders>
+          <w:top w:val="none" w:color="000000" w:sz="4" w:space="0"/>
+          <w:left w:val="none" w:color="000000" w:sz="4" w:space="0"/>
+          <w:bottom w:val="none" w:color="000000" w:sz="4" w:space="0"/>
+          <w:right w:val="none" w:color="000000" w:sz="4" w:space="0"/>
+        </w:tcBorders>
+      </w:tcPr>
+    </w:tblStylePr>
+    <w:tblStylePr w:type="lastRow">
+      <w:rPr>
+        <w:b/>
+        <w:color w:val="404040"/>
+      </w:rPr>
+      <w:pPr>
+        <w:pBdr/>
+        <w:spacing/>
+        <w:ind/>
+      </w:pPr>
+      <w:tblPr>
+        <w:tblBorders/>
+      </w:tblPr>
+      <w:tcPr>
+        <w:shd w:val="clear" w:color="ffffff"/>
+        <w:tcBorders>
+          <w:top w:val="none" w:color="000000" w:sz="4" w:space="0"/>
+          <w:left w:val="none" w:color="000000" w:sz="4" w:space="0"/>
+          <w:bottom w:val="none" w:color="000000" w:sz="4" w:space="0"/>
+          <w:right w:val="none" w:color="000000" w:sz="4" w:space="0"/>
+        </w:tcBorders>
+      </w:tcPr>
+    </w:tblStylePr>
     <w:tblStylePr w:type="nwCell">
       <w:pPr>
         <w:pBdr/>
@@ -7113,9 +7776,9 @@
       </w:tcPr>
     </w:tblStylePr>
   </w:style>
-  <w:style w:type="table" w:styleId="40">
+  <w:style w:type="table" w:styleId="729">
     <w:name w:val="Grid Table 4"/>
-    <w:basedOn w:val="665"/>
+    <w:basedOn w:val="887"/>
     <w:uiPriority w:val="59"/>
     <w:pPr>
       <w:pBdr/>
@@ -7346,9 +8009,9 @@
       </w:tcPr>
     </w:tblStylePr>
   </w:style>
-  <w:style w:type="table" w:styleId="41">
+  <w:style w:type="table" w:styleId="730">
     <w:name w:val="Grid Table 4 - Accent 1"/>
-    <w:basedOn w:val="665"/>
+    <w:basedOn w:val="887"/>
     <w:uiPriority w:val="59"/>
     <w:pPr>
       <w:pBdr/>
@@ -7579,9 +8242,9 @@
       </w:tcPr>
     </w:tblStylePr>
   </w:style>
-  <w:style w:type="table" w:styleId="42">
+  <w:style w:type="table" w:styleId="731">
     <w:name w:val="Grid Table 4 - Accent 2"/>
-    <w:basedOn w:val="665"/>
+    <w:basedOn w:val="887"/>
     <w:uiPriority w:val="59"/>
     <w:pPr>
       <w:pBdr/>
@@ -7812,9 +8475,9 @@
       </w:tcPr>
     </w:tblStylePr>
   </w:style>
-  <w:style w:type="table" w:styleId="43">
+  <w:style w:type="table" w:styleId="732">
     <w:name w:val="Grid Table 4 - Accent 3"/>
-    <w:basedOn w:val="665"/>
+    <w:basedOn w:val="887"/>
     <w:uiPriority w:val="59"/>
     <w:pPr>
       <w:pBdr/>
@@ -8045,9 +8708,9 @@
       </w:tcPr>
     </w:tblStylePr>
   </w:style>
-  <w:style w:type="table" w:styleId="44">
+  <w:style w:type="table" w:styleId="733">
     <w:name w:val="Grid Table 4 - Accent 4"/>
-    <w:basedOn w:val="665"/>
+    <w:basedOn w:val="887"/>
     <w:uiPriority w:val="59"/>
     <w:pPr>
       <w:pBdr/>
@@ -8278,9 +8941,9 @@
       </w:tcPr>
     </w:tblStylePr>
   </w:style>
-  <w:style w:type="table" w:styleId="45">
+  <w:style w:type="table" w:styleId="734">
     <w:name w:val="Grid Table 4 - Accent 5"/>
-    <w:basedOn w:val="665"/>
+    <w:basedOn w:val="887"/>
     <w:uiPriority w:val="59"/>
     <w:pPr>
       <w:pBdr/>
@@ -8511,9 +9174,9 @@
       </w:tcPr>
     </w:tblStylePr>
   </w:style>
-  <w:style w:type="table" w:styleId="46">
+  <w:style w:type="table" w:styleId="735">
     <w:name w:val="Grid Table 4 - Accent 6"/>
-    <w:basedOn w:val="665"/>
+    <w:basedOn w:val="887"/>
     <w:uiPriority w:val="59"/>
     <w:pPr>
       <w:pBdr/>
@@ -8744,9 +9407,9 @@
       </w:tcPr>
     </w:tblStylePr>
   </w:style>
-  <w:style w:type="table" w:styleId="47">
+  <w:style w:type="table" w:styleId="736">
     <w:name w:val="Grid Table 5 Dark"/>
-    <w:basedOn w:val="665"/>
+    <w:basedOn w:val="887"/>
     <w:uiPriority w:val="99"/>
     <w:pPr>
       <w:pBdr/>
@@ -8972,9 +9635,9 @@
       </w:tcPr>
     </w:tblStylePr>
   </w:style>
-  <w:style w:type="table" w:styleId="48">
+  <w:style w:type="table" w:styleId="737">
     <w:name w:val="Grid Table 5 Dark- Accent 1"/>
-    <w:basedOn w:val="665"/>
+    <w:basedOn w:val="887"/>
     <w:uiPriority w:val="99"/>
     <w:pPr>
       <w:pBdr/>
@@ -9200,9 +9863,9 @@
       </w:tcPr>
     </w:tblStylePr>
   </w:style>
-  <w:style w:type="table" w:styleId="49">
+  <w:style w:type="table" w:styleId="738">
     <w:name w:val="Grid Table 5 Dark - Accent 2"/>
-    <w:basedOn w:val="665"/>
+    <w:basedOn w:val="887"/>
     <w:uiPriority w:val="99"/>
     <w:pPr>
       <w:pBdr/>
@@ -9428,9 +10091,9 @@
       </w:tcPr>
     </w:tblStylePr>
   </w:style>
-  <w:style w:type="table" w:styleId="50">
+  <w:style w:type="table" w:styleId="739">
     <w:name w:val="Grid Table 5 Dark - Accent 3"/>
-    <w:basedOn w:val="665"/>
+    <w:basedOn w:val="887"/>
     <w:uiPriority w:val="99"/>
     <w:pPr>
       <w:pBdr/>
@@ -9656,9 +10319,9 @@
       </w:tcPr>
     </w:tblStylePr>
   </w:style>
-  <w:style w:type="table" w:styleId="51">
+  <w:style w:type="table" w:styleId="740">
     <w:name w:val="Grid Table 5 Dark- Accent 4"/>
-    <w:basedOn w:val="665"/>
+    <w:basedOn w:val="887"/>
     <w:uiPriority w:val="99"/>
     <w:pPr>
       <w:pBdr/>
@@ -9884,9 +10547,9 @@
       </w:tcPr>
     </w:tblStylePr>
   </w:style>
-  <w:style w:type="table" w:styleId="52">
+  <w:style w:type="table" w:styleId="741">
     <w:name w:val="Grid Table 5 Dark - Accent 5"/>
-    <w:basedOn w:val="665"/>
+    <w:basedOn w:val="887"/>
     <w:uiPriority w:val="99"/>
     <w:pPr>
       <w:pBdr/>
@@ -10112,9 +10775,9 @@
       </w:tcPr>
     </w:tblStylePr>
   </w:style>
-  <w:style w:type="table" w:styleId="53">
+  <w:style w:type="table" w:styleId="742">
     <w:name w:val="Grid Table 5 Dark - Accent 6"/>
-    <w:basedOn w:val="665"/>
+    <w:basedOn w:val="887"/>
     <w:uiPriority w:val="99"/>
     <w:pPr>
       <w:pBdr/>
@@ -10340,9 +11003,9 @@
       </w:tcPr>
     </w:tblStylePr>
   </w:style>
-  <w:style w:type="table" w:styleId="54">
+  <w:style w:type="table" w:styleId="743">
     <w:name w:val="Grid Table 6 Colorful"/>
-    <w:basedOn w:val="665"/>
+    <w:basedOn w:val="887"/>
     <w:uiPriority w:val="99"/>
     <w:pPr>
       <w:pBdr/>
@@ -10570,9 +11233,9 @@
       </w:tcPr>
     </w:tblStylePr>
   </w:style>
-  <w:style w:type="table" w:styleId="55">
+  <w:style w:type="table" w:styleId="744">
     <w:name w:val="Grid Table 6 Colorful - Accent 1"/>
-    <w:basedOn w:val="665"/>
+    <w:basedOn w:val="887"/>
     <w:uiPriority w:val="99"/>
     <w:pPr>
       <w:pBdr/>
@@ -10800,9 +11463,9 @@
       </w:tcPr>
     </w:tblStylePr>
   </w:style>
-  <w:style w:type="table" w:styleId="56">
+  <w:style w:type="table" w:styleId="745">
     <w:name w:val="Grid Table 6 Colorful - Accent 2"/>
-    <w:basedOn w:val="665"/>
+    <w:basedOn w:val="887"/>
     <w:uiPriority w:val="99"/>
     <w:pPr>
       <w:pBdr/>
@@ -11030,9 +11693,9 @@
       </w:tcPr>
     </w:tblStylePr>
   </w:style>
-  <w:style w:type="table" w:styleId="57">
+  <w:style w:type="table" w:styleId="746">
     <w:name w:val="Grid Table 6 Colorful - Accent 3"/>
-    <w:basedOn w:val="665"/>
+    <w:basedOn w:val="887"/>
     <w:uiPriority w:val="99"/>
     <w:pPr>
       <w:pBdr/>
@@ -11260,9 +11923,9 @@
       </w:tcPr>
     </w:tblStylePr>
   </w:style>
-  <w:style w:type="table" w:styleId="58">
+  <w:style w:type="table" w:styleId="747">
     <w:name w:val="Grid Table 6 Colorful - Accent 4"/>
-    <w:basedOn w:val="665"/>
+    <w:basedOn w:val="887"/>
     <w:uiPriority w:val="99"/>
     <w:pPr>
       <w:pBdr/>
@@ -11490,9 +12153,9 @@
       </w:tcPr>
     </w:tblStylePr>
   </w:style>
-  <w:style w:type="table" w:styleId="59">
+  <w:style w:type="table" w:styleId="748">
     <w:name w:val="Grid Table 6 Colorful - Accent 5"/>
-    <w:basedOn w:val="665"/>
+    <w:basedOn w:val="887"/>
     <w:uiPriority w:val="99"/>
     <w:pPr>
       <w:pBdr/>
@@ -11720,9 +12383,9 @@
       </w:tcPr>
     </w:tblStylePr>
   </w:style>
-  <w:style w:type="table" w:styleId="60">
+  <w:style w:type="table" w:styleId="749">
     <w:name w:val="Grid Table 6 Colorful - Accent 6"/>
-    <w:basedOn w:val="665"/>
+    <w:basedOn w:val="887"/>
     <w:uiPriority w:val="99"/>
     <w:pPr>
       <w:pBdr/>
@@ -11950,9 +12613,9 @@
       </w:tcPr>
     </w:tblStylePr>
   </w:style>
-  <w:style w:type="table" w:styleId="61">
+  <w:style w:type="table" w:styleId="750">
     <w:name w:val="Grid Table 7 Colorful"/>
-    <w:basedOn w:val="665"/>
+    <w:basedOn w:val="887"/>
     <w:uiPriority w:val="99"/>
     <w:pPr>
       <w:pBdr/>
@@ -12054,11 +12717,11 @@
         <w:tblBorders/>
       </w:tblPr>
       <w:tcPr>
-        <w:shd w:color="ffffff"/>
+        <w:shd w:val="clear" w:color="ffffff"/>
         <w:tcBorders>
-          <w:top w:val="none"/>
-          <w:left w:val="none"/>
-          <w:bottom w:val="none"/>
+          <w:top w:val="none" w:color="000000" w:sz="4" w:space="0"/>
+          <w:left w:val="none" w:color="000000" w:sz="4" w:space="0"/>
+          <w:bottom w:val="none" w:color="000000" w:sz="4" w:space="0"/>
           <w:right w:val="single" w:color="000000" w:themeColor="text1" w:themeTint="80" w:sz="4" w:space="0"/>
         </w:tcBorders>
       </w:tcPr>
@@ -12081,10 +12744,10 @@
       <w:tcPr>
         <w:shd w:val="clear" w:color="ffffff" w:themeColor="light1" w:fill="ffffff" w:themeFill="light1"/>
         <w:tcBorders>
-          <w:top w:val="none"/>
-          <w:left w:val="none"/>
+          <w:top w:val="none" w:color="000000" w:sz="4" w:space="0"/>
+          <w:left w:val="none" w:color="000000" w:sz="4" w:space="0"/>
           <w:bottom w:val="single" w:color="000000" w:themeColor="text1" w:themeTint="80" w:sz="4" w:space="0"/>
-          <w:right w:val="none"/>
+          <w:right w:val="none" w:color="000000" w:sz="4" w:space="0"/>
         </w:tcBorders>
       </w:tcPr>
     </w:tblStylePr>
@@ -12104,12 +12767,12 @@
         <w:tblBorders/>
       </w:tblPr>
       <w:tcPr>
-        <w:shd w:color="ffffff"/>
+        <w:shd w:val="clear" w:color="ffffff"/>
         <w:tcBorders>
-          <w:top w:val="none"/>
+          <w:top w:val="none" w:color="000000" w:sz="4" w:space="0"/>
           <w:left w:val="single" w:color="000000" w:themeColor="text1" w:themeTint="80" w:sz="4" w:space="0"/>
-          <w:bottom w:val="none"/>
-          <w:right w:val="none"/>
+          <w:bottom w:val="none" w:color="000000" w:sz="4" w:space="0"/>
+          <w:right w:val="none" w:color="000000" w:sz="4" w:space="0"/>
         </w:tcBorders>
       </w:tcPr>
     </w:tblStylePr>
@@ -12132,9 +12795,9 @@
         <w:shd w:val="clear" w:color="ffffff" w:themeColor="light1" w:fill="ffffff" w:themeFill="light1"/>
         <w:tcBorders>
           <w:top w:val="single" w:color="000000" w:themeColor="text1" w:themeTint="80" w:sz="4" w:space="0"/>
-          <w:left w:val="none"/>
-          <w:bottom w:val="none"/>
-          <w:right w:val="none"/>
+          <w:left w:val="none" w:color="000000" w:sz="4" w:space="0"/>
+          <w:bottom w:val="none" w:color="000000" w:sz="4" w:space="0"/>
+          <w:right w:val="none" w:color="000000" w:sz="4" w:space="0"/>
         </w:tcBorders>
       </w:tcPr>
     </w:tblStylePr>
@@ -12204,9 +12867,9 @@
       </w:tcPr>
     </w:tblStylePr>
   </w:style>
-  <w:style w:type="table" w:styleId="62">
+  <w:style w:type="table" w:styleId="751">
     <w:name w:val="Grid Table 7 Colorful - Accent 1"/>
-    <w:basedOn w:val="665"/>
+    <w:basedOn w:val="887"/>
     <w:uiPriority w:val="99"/>
     <w:pPr>
       <w:pBdr/>
@@ -12308,11 +12971,11 @@
         <w:tblBorders/>
       </w:tblPr>
       <w:tcPr>
-        <w:shd w:color="ffffff"/>
+        <w:shd w:val="clear" w:color="ffffff"/>
         <w:tcBorders>
-          <w:top w:val="none"/>
-          <w:left w:val="none"/>
-          <w:bottom w:val="none"/>
+          <w:top w:val="none" w:color="000000" w:sz="4" w:space="0"/>
+          <w:left w:val="none" w:color="000000" w:sz="4" w:space="0"/>
+          <w:bottom w:val="none" w:color="000000" w:sz="4" w:space="0"/>
           <w:right w:val="single" w:color="000000" w:themeColor="accent1" w:themeTint="80" w:sz="4" w:space="0"/>
         </w:tcBorders>
       </w:tcPr>
@@ -12335,10 +12998,10 @@
       <w:tcPr>
         <w:shd w:val="clear" w:color="ffffff" w:themeColor="light1" w:fill="ffffff" w:themeFill="light1"/>
         <w:tcBorders>
-          <w:top w:val="none"/>
-          <w:left w:val="none"/>
+          <w:top w:val="none" w:color="000000" w:sz="4" w:space="0"/>
+          <w:left w:val="none" w:color="000000" w:sz="4" w:space="0"/>
           <w:bottom w:val="single" w:color="000000" w:themeColor="accent1" w:themeTint="80" w:sz="4" w:space="0"/>
-          <w:right w:val="none"/>
+          <w:right w:val="none" w:color="000000" w:sz="4" w:space="0"/>
         </w:tcBorders>
       </w:tcPr>
     </w:tblStylePr>
@@ -12358,12 +13021,12 @@
         <w:tblBorders/>
       </w:tblPr>
       <w:tcPr>
-        <w:shd w:color="ffffff"/>
+        <w:shd w:val="clear" w:color="ffffff"/>
         <w:tcBorders>
-          <w:top w:val="none"/>
+          <w:top w:val="none" w:color="000000" w:sz="4" w:space="0"/>
           <w:left w:val="single" w:color="000000" w:themeColor="accent1" w:themeTint="80" w:sz="4" w:space="0"/>
-          <w:bottom w:val="none"/>
-          <w:right w:val="none"/>
+          <w:bottom w:val="none" w:color="000000" w:sz="4" w:space="0"/>
+          <w:right w:val="none" w:color="000000" w:sz="4" w:space="0"/>
         </w:tcBorders>
       </w:tcPr>
     </w:tblStylePr>
@@ -12386,9 +13049,9 @@
         <w:shd w:val="clear" w:color="ffffff" w:themeColor="light1" w:fill="ffffff" w:themeFill="light1"/>
         <w:tcBorders>
           <w:top w:val="single" w:color="000000" w:themeColor="accent1" w:themeTint="80" w:sz="4" w:space="0"/>
-          <w:left w:val="none"/>
-          <w:bottom w:val="none"/>
-          <w:right w:val="none"/>
+          <w:left w:val="none" w:color="000000" w:sz="4" w:space="0"/>
+          <w:bottom w:val="none" w:color="000000" w:sz="4" w:space="0"/>
+          <w:right w:val="none" w:color="000000" w:sz="4" w:space="0"/>
         </w:tcBorders>
       </w:tcPr>
     </w:tblStylePr>
@@ -12458,9 +13121,9 @@
       </w:tcPr>
     </w:tblStylePr>
   </w:style>
-  <w:style w:type="table" w:styleId="63">
+  <w:style w:type="table" w:styleId="752">
     <w:name w:val="Grid Table 7 Colorful - Accent 2"/>
-    <w:basedOn w:val="665"/>
+    <w:basedOn w:val="887"/>
     <w:uiPriority w:val="99"/>
     <w:pPr>
       <w:pBdr/>
@@ -12562,11 +13225,11 @@
         <w:tblBorders/>
       </w:tblPr>
       <w:tcPr>
-        <w:shd w:color="ffffff"/>
+        <w:shd w:val="clear" w:color="ffffff"/>
         <w:tcBorders>
-          <w:top w:val="none"/>
-          <w:left w:val="none"/>
-          <w:bottom w:val="none"/>
+          <w:top w:val="none" w:color="000000" w:sz="4" w:space="0"/>
+          <w:left w:val="none" w:color="000000" w:sz="4" w:space="0"/>
+          <w:bottom w:val="none" w:color="000000" w:sz="4" w:space="0"/>
           <w:right w:val="single" w:color="000000" w:themeColor="accent2" w:themeTint="97" w:sz="4" w:space="0"/>
         </w:tcBorders>
       </w:tcPr>
@@ -12589,10 +13252,10 @@
       <w:tcPr>
         <w:shd w:val="clear" w:color="ffffff" w:themeColor="light1" w:fill="ffffff" w:themeFill="light1"/>
         <w:tcBorders>
-          <w:top w:val="none"/>
-          <w:left w:val="none"/>
+          <w:top w:val="none" w:color="000000" w:sz="4" w:space="0"/>
+          <w:left w:val="none" w:color="000000" w:sz="4" w:space="0"/>
           <w:bottom w:val="single" w:color="000000" w:themeColor="accent2" w:themeTint="97" w:sz="4" w:space="0"/>
-          <w:right w:val="none"/>
+          <w:right w:val="none" w:color="000000" w:sz="4" w:space="0"/>
         </w:tcBorders>
       </w:tcPr>
     </w:tblStylePr>
@@ -12612,12 +13275,12 @@
         <w:tblBorders/>
       </w:tblPr>
       <w:tcPr>
-        <w:shd w:color="ffffff"/>
+        <w:shd w:val="clear" w:color="ffffff"/>
         <w:tcBorders>
-          <w:top w:val="none"/>
+          <w:top w:val="none" w:color="000000" w:sz="4" w:space="0"/>
           <w:left w:val="single" w:color="000000" w:themeColor="accent2" w:themeTint="97" w:sz="4" w:space="0"/>
-          <w:bottom w:val="none"/>
-          <w:right w:val="none"/>
+          <w:bottom w:val="none" w:color="000000" w:sz="4" w:space="0"/>
+          <w:right w:val="none" w:color="000000" w:sz="4" w:space="0"/>
         </w:tcBorders>
       </w:tcPr>
     </w:tblStylePr>
@@ -12640,9 +13303,9 @@
         <w:shd w:val="clear" w:color="ffffff" w:themeColor="light1" w:fill="ffffff" w:themeFill="light1"/>
         <w:tcBorders>
           <w:top w:val="single" w:color="000000" w:themeColor="accent2" w:themeTint="97" w:sz="4" w:space="0"/>
-          <w:left w:val="none"/>
-          <w:bottom w:val="none"/>
-          <w:right w:val="none"/>
+          <w:left w:val="none" w:color="000000" w:sz="4" w:space="0"/>
+          <w:bottom w:val="none" w:color="000000" w:sz="4" w:space="0"/>
+          <w:right w:val="none" w:color="000000" w:sz="4" w:space="0"/>
         </w:tcBorders>
       </w:tcPr>
     </w:tblStylePr>
@@ -12712,9 +13375,9 @@
       </w:tcPr>
     </w:tblStylePr>
   </w:style>
-  <w:style w:type="table" w:styleId="64">
+  <w:style w:type="table" w:styleId="753">
     <w:name w:val="Grid Table 7 Colorful - Accent 3"/>
-    <w:basedOn w:val="665"/>
+    <w:basedOn w:val="887"/>
     <w:uiPriority w:val="99"/>
     <w:pPr>
       <w:pBdr/>
@@ -12816,11 +13479,11 @@
         <w:tblBorders/>
       </w:tblPr>
       <w:tcPr>
-        <w:shd w:color="ffffff"/>
+        <w:shd w:val="clear" w:color="ffffff"/>
         <w:tcBorders>
-          <w:top w:val="none"/>
-          <w:left w:val="none"/>
-          <w:bottom w:val="none"/>
+          <w:top w:val="none" w:color="000000" w:sz="4" w:space="0"/>
+          <w:left w:val="none" w:color="000000" w:sz="4" w:space="0"/>
+          <w:bottom w:val="none" w:color="000000" w:sz="4" w:space="0"/>
           <w:right w:val="single" w:color="000000" w:themeColor="accent3" w:themeTint="FE" w:sz="4" w:space="0"/>
         </w:tcBorders>
       </w:tcPr>
@@ -12843,10 +13506,10 @@
       <w:tcPr>
         <w:shd w:val="clear" w:color="ffffff" w:themeColor="light1" w:fill="ffffff" w:themeFill="light1"/>
         <w:tcBorders>
-          <w:top w:val="none"/>
-          <w:left w:val="none"/>
+          <w:top w:val="none" w:color="000000" w:sz="4" w:space="0"/>
+          <w:left w:val="none" w:color="000000" w:sz="4" w:space="0"/>
           <w:bottom w:val="single" w:color="000000" w:themeColor="accent3" w:themeTint="FE" w:sz="4" w:space="0"/>
-          <w:right w:val="none"/>
+          <w:right w:val="none" w:color="000000" w:sz="4" w:space="0"/>
         </w:tcBorders>
       </w:tcPr>
     </w:tblStylePr>
@@ -12866,12 +13529,12 @@
         <w:tblBorders/>
       </w:tblPr>
       <w:tcPr>
-        <w:shd w:color="ffffff"/>
+        <w:shd w:val="clear" w:color="ffffff"/>
         <w:tcBorders>
-          <w:top w:val="none"/>
+          <w:top w:val="none" w:color="000000" w:sz="4" w:space="0"/>
           <w:left w:val="single" w:color="000000" w:themeColor="accent3" w:themeTint="FE" w:sz="4" w:space="0"/>
-          <w:bottom w:val="none"/>
-          <w:right w:val="none"/>
+          <w:bottom w:val="none" w:color="000000" w:sz="4" w:space="0"/>
+          <w:right w:val="none" w:color="000000" w:sz="4" w:space="0"/>
         </w:tcBorders>
       </w:tcPr>
     </w:tblStylePr>
@@ -12894,9 +13557,9 @@
         <w:shd w:val="clear" w:color="ffffff" w:themeColor="light1" w:fill="ffffff" w:themeFill="light1"/>
         <w:tcBorders>
           <w:top w:val="single" w:color="000000" w:themeColor="accent3" w:themeTint="FE" w:sz="4" w:space="0"/>
-          <w:left w:val="none"/>
-          <w:bottom w:val="none"/>
-          <w:right w:val="none"/>
+          <w:left w:val="none" w:color="000000" w:sz="4" w:space="0"/>
+          <w:bottom w:val="none" w:color="000000" w:sz="4" w:space="0"/>
+          <w:right w:val="none" w:color="000000" w:sz="4" w:space="0"/>
         </w:tcBorders>
       </w:tcPr>
     </w:tblStylePr>
@@ -12966,9 +13629,9 @@
       </w:tcPr>
     </w:tblStylePr>
   </w:style>
-  <w:style w:type="table" w:styleId="65">
+  <w:style w:type="table" w:styleId="754">
     <w:name w:val="Grid Table 7 Colorful - Accent 4"/>
-    <w:basedOn w:val="665"/>
+    <w:basedOn w:val="887"/>
     <w:uiPriority w:val="99"/>
     <w:pPr>
       <w:pBdr/>
@@ -13070,11 +13733,11 @@
         <w:tblBorders/>
       </w:tblPr>
       <w:tcPr>
-        <w:shd w:color="ffffff"/>
+        <w:shd w:val="clear" w:color="ffffff"/>
         <w:tcBorders>
-          <w:top w:val="none"/>
-          <w:left w:val="none"/>
-          <w:bottom w:val="none"/>
+          <w:top w:val="none" w:color="000000" w:sz="4" w:space="0"/>
+          <w:left w:val="none" w:color="000000" w:sz="4" w:space="0"/>
+          <w:bottom w:val="none" w:color="000000" w:sz="4" w:space="0"/>
           <w:right w:val="single" w:color="000000" w:themeColor="accent4" w:themeTint="9A" w:sz="4" w:space="0"/>
         </w:tcBorders>
       </w:tcPr>
@@ -13097,10 +13760,10 @@
       <w:tcPr>
         <w:shd w:val="clear" w:color="ffffff" w:themeColor="light1" w:fill="ffffff" w:themeFill="light1"/>
         <w:tcBorders>
-          <w:top w:val="none"/>
-          <w:left w:val="none"/>
+          <w:top w:val="none" w:color="000000" w:sz="4" w:space="0"/>
+          <w:left w:val="none" w:color="000000" w:sz="4" w:space="0"/>
           <w:bottom w:val="single" w:color="000000" w:themeColor="accent4" w:themeTint="9A" w:sz="4" w:space="0"/>
-          <w:right w:val="none"/>
+          <w:right w:val="none" w:color="000000" w:sz="4" w:space="0"/>
         </w:tcBorders>
       </w:tcPr>
     </w:tblStylePr>
@@ -13120,12 +13783,12 @@
         <w:tblBorders/>
       </w:tblPr>
       <w:tcPr>
-        <w:shd w:color="ffffff"/>
+        <w:shd w:val="clear" w:color="ffffff"/>
         <w:tcBorders>
-          <w:top w:val="none"/>
+          <w:top w:val="none" w:color="000000" w:sz="4" w:space="0"/>
           <w:left w:val="single" w:color="000000" w:themeColor="accent4" w:themeTint="9A" w:sz="4" w:space="0"/>
-          <w:bottom w:val="none"/>
-          <w:right w:val="none"/>
+          <w:bottom w:val="none" w:color="000000" w:sz="4" w:space="0"/>
+          <w:right w:val="none" w:color="000000" w:sz="4" w:space="0"/>
         </w:tcBorders>
       </w:tcPr>
     </w:tblStylePr>
@@ -13148,9 +13811,9 @@
         <w:shd w:val="clear" w:color="ffffff" w:themeColor="light1" w:fill="ffffff" w:themeFill="light1"/>
         <w:tcBorders>
           <w:top w:val="single" w:color="000000" w:themeColor="accent4" w:themeTint="9A" w:sz="4" w:space="0"/>
-          <w:left w:val="none"/>
-          <w:bottom w:val="none"/>
-          <w:right w:val="none"/>
+          <w:left w:val="none" w:color="000000" w:sz="4" w:space="0"/>
+          <w:bottom w:val="none" w:color="000000" w:sz="4" w:space="0"/>
+          <w:right w:val="none" w:color="000000" w:sz="4" w:space="0"/>
         </w:tcBorders>
       </w:tcPr>
     </w:tblStylePr>
@@ -13220,9 +13883,9 @@
       </w:tcPr>
     </w:tblStylePr>
   </w:style>
-  <w:style w:type="table" w:styleId="66">
+  <w:style w:type="table" w:styleId="755">
     <w:name w:val="Grid Table 7 Colorful - Accent 5"/>
-    <w:basedOn w:val="665"/>
+    <w:basedOn w:val="887"/>
     <w:uiPriority w:val="99"/>
     <w:pPr>
       <w:pBdr/>
@@ -13324,11 +13987,11 @@
         <w:tblBorders/>
       </w:tblPr>
       <w:tcPr>
-        <w:shd w:color="ffffff"/>
+        <w:shd w:val="clear" w:color="ffffff"/>
         <w:tcBorders>
-          <w:top w:val="none"/>
-          <w:left w:val="none"/>
-          <w:bottom w:val="none"/>
+          <w:top w:val="none" w:color="000000" w:sz="4" w:space="0"/>
+          <w:left w:val="none" w:color="000000" w:sz="4" w:space="0"/>
+          <w:bottom w:val="none" w:color="000000" w:sz="4" w:space="0"/>
           <w:right w:val="single" w:color="000000" w:themeColor="accent5" w:themeTint="90" w:sz="4" w:space="0"/>
         </w:tcBorders>
       </w:tcPr>
@@ -13351,10 +14014,10 @@
       <w:tcPr>
         <w:shd w:val="clear" w:color="ffffff" w:themeColor="light1" w:fill="ffffff" w:themeFill="light1"/>
         <w:tcBorders>
-          <w:top w:val="none"/>
-          <w:left w:val="none"/>
+          <w:top w:val="none" w:color="000000" w:sz="4" w:space="0"/>
+          <w:left w:val="none" w:color="000000" w:sz="4" w:space="0"/>
           <w:bottom w:val="single" w:color="000000" w:themeColor="accent5" w:themeTint="90" w:sz="4" w:space="0"/>
-          <w:right w:val="none"/>
+          <w:right w:val="none" w:color="000000" w:sz="4" w:space="0"/>
         </w:tcBorders>
       </w:tcPr>
     </w:tblStylePr>
@@ -13374,12 +14037,12 @@
         <w:tblBorders/>
       </w:tblPr>
       <w:tcPr>
-        <w:shd w:color="ffffff"/>
+        <w:shd w:val="clear" w:color="ffffff"/>
         <w:tcBorders>
-          <w:top w:val="none"/>
+          <w:top w:val="none" w:color="000000" w:sz="4" w:space="0"/>
           <w:left w:val="single" w:color="000000" w:themeColor="accent5" w:themeTint="90" w:sz="4" w:space="0"/>
-          <w:bottom w:val="none"/>
-          <w:right w:val="none"/>
+          <w:bottom w:val="none" w:color="000000" w:sz="4" w:space="0"/>
+          <w:right w:val="none" w:color="000000" w:sz="4" w:space="0"/>
         </w:tcBorders>
       </w:tcPr>
     </w:tblStylePr>
@@ -13402,9 +14065,9 @@
         <w:shd w:val="clear" w:color="ffffff" w:themeColor="light1" w:fill="ffffff" w:themeFill="light1"/>
         <w:tcBorders>
           <w:top w:val="single" w:color="000000" w:themeColor="accent5" w:themeTint="90" w:sz="4" w:space="0"/>
-          <w:left w:val="none"/>
-          <w:bottom w:val="none"/>
-          <w:right w:val="none"/>
+          <w:left w:val="none" w:color="000000" w:sz="4" w:space="0"/>
+          <w:bottom w:val="none" w:color="000000" w:sz="4" w:space="0"/>
+          <w:right w:val="none" w:color="000000" w:sz="4" w:space="0"/>
         </w:tcBorders>
       </w:tcPr>
     </w:tblStylePr>
@@ -13474,9 +14137,9 @@
       </w:tcPr>
     </w:tblStylePr>
   </w:style>
-  <w:style w:type="table" w:styleId="67">
+  <w:style w:type="table" w:styleId="756">
     <w:name w:val="Grid Table 7 Colorful - Accent 6"/>
-    <w:basedOn w:val="665"/>
+    <w:basedOn w:val="887"/>
     <w:uiPriority w:val="99"/>
     <w:pPr>
       <w:pBdr/>
@@ -13578,11 +14241,11 @@
         <w:tblBorders/>
       </w:tblPr>
       <w:tcPr>
-        <w:shd w:color="ffffff"/>
+        <w:shd w:val="clear" w:color="ffffff"/>
         <w:tcBorders>
-          <w:top w:val="none"/>
-          <w:left w:val="none"/>
-          <w:bottom w:val="none"/>
+          <w:top w:val="none" w:color="000000" w:sz="4" w:space="0"/>
+          <w:left w:val="none" w:color="000000" w:sz="4" w:space="0"/>
+          <w:bottom w:val="none" w:color="000000" w:sz="4" w:space="0"/>
           <w:right w:val="single" w:color="000000" w:themeColor="accent6" w:themeTint="90" w:sz="4" w:space="0"/>
         </w:tcBorders>
       </w:tcPr>
@@ -13605,10 +14268,10 @@
       <w:tcPr>
         <w:shd w:val="clear" w:color="ffffff" w:themeColor="light1" w:fill="ffffff" w:themeFill="light1"/>
         <w:tcBorders>
-          <w:top w:val="none"/>
-          <w:left w:val="none"/>
+          <w:top w:val="none" w:color="000000" w:sz="4" w:space="0"/>
+          <w:left w:val="none" w:color="000000" w:sz="4" w:space="0"/>
           <w:bottom w:val="single" w:color="000000" w:themeColor="accent6" w:themeTint="90" w:sz="4" w:space="0"/>
-          <w:right w:val="none"/>
+          <w:right w:val="none" w:color="000000" w:sz="4" w:space="0"/>
         </w:tcBorders>
       </w:tcPr>
     </w:tblStylePr>
@@ -13628,12 +14291,12 @@
         <w:tblBorders/>
       </w:tblPr>
       <w:tcPr>
-        <w:shd w:color="ffffff"/>
+        <w:shd w:val="clear" w:color="ffffff"/>
         <w:tcBorders>
-          <w:top w:val="none"/>
+          <w:top w:val="none" w:color="000000" w:sz="4" w:space="0"/>
           <w:left w:val="single" w:color="000000" w:themeColor="accent6" w:themeTint="90" w:sz="4" w:space="0"/>
-          <w:bottom w:val="none"/>
-          <w:right w:val="none"/>
+          <w:bottom w:val="none" w:color="000000" w:sz="4" w:space="0"/>
+          <w:right w:val="none" w:color="000000" w:sz="4" w:space="0"/>
         </w:tcBorders>
       </w:tcPr>
     </w:tblStylePr>
@@ -13656,9 +14319,9 @@
         <w:shd w:val="clear" w:color="ffffff" w:themeColor="light1" w:fill="ffffff" w:themeFill="light1"/>
         <w:tcBorders>
           <w:top w:val="single" w:color="000000" w:themeColor="accent6" w:themeTint="90" w:sz="4" w:space="0"/>
-          <w:left w:val="none"/>
-          <w:bottom w:val="none"/>
-          <w:right w:val="none"/>
+          <w:left w:val="none" w:color="000000" w:sz="4" w:space="0"/>
+          <w:bottom w:val="none" w:color="000000" w:sz="4" w:space="0"/>
+          <w:right w:val="none" w:color="000000" w:sz="4" w:space="0"/>
         </w:tcBorders>
       </w:tcPr>
     </w:tblStylePr>
@@ -13728,9 +14391,9 @@
       </w:tcPr>
     </w:tblStylePr>
   </w:style>
-  <w:style w:type="table" w:styleId="68">
+  <w:style w:type="table" w:styleId="757">
     <w:name w:val="List Table 1 Light"/>
-    <w:basedOn w:val="665"/>
+    <w:basedOn w:val="887"/>
     <w:uiPriority w:val="99"/>
     <w:pPr>
       <w:pBdr/>
@@ -13944,9 +14607,9 @@
       </w:tcPr>
     </w:tblStylePr>
   </w:style>
-  <w:style w:type="table" w:styleId="69">
+  <w:style w:type="table" w:styleId="758">
     <w:name w:val="List Table 1 Light - Accent 1"/>
-    <w:basedOn w:val="665"/>
+    <w:basedOn w:val="887"/>
     <w:uiPriority w:val="99"/>
     <w:pPr>
       <w:pBdr/>
@@ -14160,9 +14823,9 @@
       </w:tcPr>
     </w:tblStylePr>
   </w:style>
-  <w:style w:type="table" w:styleId="70">
+  <w:style w:type="table" w:styleId="759">
     <w:name w:val="List Table 1 Light - Accent 2"/>
-    <w:basedOn w:val="665"/>
+    <w:basedOn w:val="887"/>
     <w:uiPriority w:val="99"/>
     <w:pPr>
       <w:pBdr/>
@@ -14376,9 +15039,9 @@
       </w:tcPr>
     </w:tblStylePr>
   </w:style>
-  <w:style w:type="table" w:styleId="71">
+  <w:style w:type="table" w:styleId="760">
     <w:name w:val="List Table 1 Light - Accent 3"/>
-    <w:basedOn w:val="665"/>
+    <w:basedOn w:val="887"/>
     <w:uiPriority w:val="99"/>
     <w:pPr>
       <w:pBdr/>
@@ -14592,9 +15255,9 @@
       </w:tcPr>
     </w:tblStylePr>
   </w:style>
-  <w:style w:type="table" w:styleId="72">
+  <w:style w:type="table" w:styleId="761">
     <w:name w:val="List Table 1 Light - Accent 4"/>
-    <w:basedOn w:val="665"/>
+    <w:basedOn w:val="887"/>
     <w:uiPriority w:val="99"/>
     <w:pPr>
       <w:pBdr/>
@@ -14808,9 +15471,9 @@
       </w:tcPr>
     </w:tblStylePr>
   </w:style>
-  <w:style w:type="table" w:styleId="73">
+  <w:style w:type="table" w:styleId="762">
     <w:name w:val="List Table 1 Light - Accent 5"/>
-    <w:basedOn w:val="665"/>
+    <w:basedOn w:val="887"/>
     <w:uiPriority w:val="99"/>
     <w:pPr>
       <w:pBdr/>
@@ -15024,9 +15687,9 @@
       </w:tcPr>
     </w:tblStylePr>
   </w:style>
-  <w:style w:type="table" w:styleId="74">
+  <w:style w:type="table" w:styleId="763">
     <w:name w:val="List Table 1 Light - Accent 6"/>
-    <w:basedOn w:val="665"/>
+    <w:basedOn w:val="887"/>
     <w:uiPriority w:val="99"/>
     <w:pPr>
       <w:pBdr/>
@@ -15240,9 +15903,9 @@
       </w:tcPr>
     </w:tblStylePr>
   </w:style>
-  <w:style w:type="table" w:styleId="75">
+  <w:style w:type="table" w:styleId="764">
     <w:name w:val="List Table 2"/>
-    <w:basedOn w:val="665"/>
+    <w:basedOn w:val="887"/>
     <w:uiPriority w:val="99"/>
     <w:pPr>
       <w:pBdr/>
@@ -15478,9 +16141,9 @@
       </w:tcPr>
     </w:tblStylePr>
   </w:style>
-  <w:style w:type="table" w:styleId="76">
+  <w:style w:type="table" w:styleId="765">
     <w:name w:val="List Table 2 - Accent 1"/>
-    <w:basedOn w:val="665"/>
+    <w:basedOn w:val="887"/>
     <w:uiPriority w:val="99"/>
     <w:pPr>
       <w:pBdr/>
@@ -15716,9 +16379,9 @@
       </w:tcPr>
     </w:tblStylePr>
   </w:style>
-  <w:style w:type="table" w:styleId="77">
+  <w:style w:type="table" w:styleId="766">
     <w:name w:val="List Table 2 - Accent 2"/>
-    <w:basedOn w:val="665"/>
+    <w:basedOn w:val="887"/>
     <w:uiPriority w:val="99"/>
     <w:pPr>
       <w:pBdr/>
@@ -15954,9 +16617,9 @@
       </w:tcPr>
     </w:tblStylePr>
   </w:style>
-  <w:style w:type="table" w:styleId="78">
+  <w:style w:type="table" w:styleId="767">
     <w:name w:val="List Table 2 - Accent 3"/>
-    <w:basedOn w:val="665"/>
+    <w:basedOn w:val="887"/>
     <w:uiPriority w:val="99"/>
     <w:pPr>
       <w:pBdr/>
@@ -16192,9 +16855,9 @@
       </w:tcPr>
     </w:tblStylePr>
   </w:style>
-  <w:style w:type="table" w:styleId="79">
+  <w:style w:type="table" w:styleId="768">
     <w:name w:val="List Table 2 - Accent 4"/>
-    <w:basedOn w:val="665"/>
+    <w:basedOn w:val="887"/>
     <w:uiPriority w:val="99"/>
     <w:pPr>
       <w:pBdr/>
@@ -16430,9 +17093,9 @@
       </w:tcPr>
     </w:tblStylePr>
   </w:style>
-  <w:style w:type="table" w:styleId="80">
+  <w:style w:type="table" w:styleId="769">
     <w:name w:val="List Table 2 - Accent 5"/>
-    <w:basedOn w:val="665"/>
+    <w:basedOn w:val="887"/>
     <w:uiPriority w:val="99"/>
     <w:pPr>
       <w:pBdr/>
@@ -16668,9 +17331,9 @@
       </w:tcPr>
     </w:tblStylePr>
   </w:style>
-  <w:style w:type="table" w:styleId="81">
+  <w:style w:type="table" w:styleId="770">
     <w:name w:val="List Table 2 - Accent 6"/>
-    <w:basedOn w:val="665"/>
+    <w:basedOn w:val="887"/>
     <w:uiPriority w:val="99"/>
     <w:pPr>
       <w:pBdr/>
@@ -16906,9 +17569,9 @@
       </w:tcPr>
     </w:tblStylePr>
   </w:style>
-  <w:style w:type="table" w:styleId="82">
+  <w:style w:type="table" w:styleId="771">
     <w:name w:val="List Table 3"/>
-    <w:basedOn w:val="665"/>
+    <w:basedOn w:val="887"/>
     <w:uiPriority w:val="99"/>
     <w:pPr>
       <w:pBdr/>
@@ -17134,9 +17797,9 @@
       </w:tcPr>
     </w:tblStylePr>
   </w:style>
-  <w:style w:type="table" w:styleId="83">
+  <w:style w:type="table" w:styleId="772">
     <w:name w:val="List Table 3 - Accent 1"/>
-    <w:basedOn w:val="665"/>
+    <w:basedOn w:val="887"/>
     <w:uiPriority w:val="99"/>
     <w:pPr>
       <w:pBdr/>
@@ -17362,9 +18025,9 @@
       </w:tcPr>
     </w:tblStylePr>
   </w:style>
-  <w:style w:type="table" w:styleId="84">
+  <w:style w:type="table" w:styleId="773">
     <w:name w:val="List Table 3 - Accent 2"/>
-    <w:basedOn w:val="665"/>
+    <w:basedOn w:val="887"/>
     <w:uiPriority w:val="99"/>
     <w:pPr>
       <w:pBdr/>
@@ -17590,9 +18253,9 @@
       </w:tcPr>
     </w:tblStylePr>
   </w:style>
-  <w:style w:type="table" w:styleId="85">
+  <w:style w:type="table" w:styleId="774">
     <w:name w:val="List Table 3 - Accent 3"/>
-    <w:basedOn w:val="665"/>
+    <w:basedOn w:val="887"/>
     <w:uiPriority w:val="99"/>
     <w:pPr>
       <w:pBdr/>
@@ -17818,9 +18481,9 @@
       </w:tcPr>
     </w:tblStylePr>
   </w:style>
-  <w:style w:type="table" w:styleId="86">
+  <w:style w:type="table" w:styleId="775">
     <w:name w:val="List Table 3 - Accent 4"/>
-    <w:basedOn w:val="665"/>
+    <w:basedOn w:val="887"/>
     <w:uiPriority w:val="99"/>
     <w:pPr>
       <w:pBdr/>
@@ -18046,9 +18709,9 @@
       </w:tcPr>
     </w:tblStylePr>
   </w:style>
-  <w:style w:type="table" w:styleId="87">
+  <w:style w:type="table" w:styleId="776">
     <w:name w:val="List Table 3 - Accent 5"/>
-    <w:basedOn w:val="665"/>
+    <w:basedOn w:val="887"/>
     <w:uiPriority w:val="99"/>
     <w:pPr>
       <w:pBdr/>
@@ -18274,9 +18937,9 @@
       </w:tcPr>
     </w:tblStylePr>
   </w:style>
-  <w:style w:type="table" w:styleId="88">
+  <w:style w:type="table" w:styleId="777">
     <w:name w:val="List Table 3 - Accent 6"/>
-    <w:basedOn w:val="665"/>
+    <w:basedOn w:val="887"/>
     <w:uiPriority w:val="99"/>
     <w:pPr>
       <w:pBdr/>
@@ -18502,9 +19165,9 @@
       </w:tcPr>
     </w:tblStylePr>
   </w:style>
-  <w:style w:type="table" w:styleId="89">
+  <w:style w:type="table" w:styleId="778">
     <w:name w:val="List Table 4"/>
-    <w:basedOn w:val="665"/>
+    <w:basedOn w:val="887"/>
     <w:uiPriority w:val="99"/>
     <w:pPr>
       <w:pBdr/>
@@ -18727,9 +19390,9 @@
       </w:tcPr>
     </w:tblStylePr>
   </w:style>
-  <w:style w:type="table" w:styleId="90">
+  <w:style w:type="table" w:styleId="779">
     <w:name w:val="List Table 4 - Accent 1"/>
-    <w:basedOn w:val="665"/>
+    <w:basedOn w:val="887"/>
     <w:uiPriority w:val="99"/>
     <w:pPr>
       <w:pBdr/>
@@ -18952,9 +19615,9 @@
       </w:tcPr>
     </w:tblStylePr>
   </w:style>
-  <w:style w:type="table" w:styleId="91">
+  <w:style w:type="table" w:styleId="780">
     <w:name w:val="List Table 4 - Accent 2"/>
-    <w:basedOn w:val="665"/>
+    <w:basedOn w:val="887"/>
     <w:uiPriority w:val="99"/>
     <w:pPr>
       <w:pBdr/>
@@ -19177,9 +19840,9 @@
       </w:tcPr>
     </w:tblStylePr>
   </w:style>
-  <w:style w:type="table" w:styleId="92">
+  <w:style w:type="table" w:styleId="781">
     <w:name w:val="List Table 4 - Accent 3"/>
-    <w:basedOn w:val="665"/>
+    <w:basedOn w:val="887"/>
     <w:uiPriority w:val="99"/>
     <w:pPr>
       <w:pBdr/>
@@ -19402,9 +20065,9 @@
       </w:tcPr>
     </w:tblStylePr>
   </w:style>
-  <w:style w:type="table" w:styleId="93">
+  <w:style w:type="table" w:styleId="782">
     <w:name w:val="List Table 4 - Accent 4"/>
-    <w:basedOn w:val="665"/>
+    <w:basedOn w:val="887"/>
     <w:uiPriority w:val="99"/>
     <w:pPr>
       <w:pBdr/>
@@ -19627,9 +20290,9 @@
       </w:tcPr>
     </w:tblStylePr>
   </w:style>
-  <w:style w:type="table" w:styleId="94">
+  <w:style w:type="table" w:styleId="783">
     <w:name w:val="List Table 4 - Accent 5"/>
-    <w:basedOn w:val="665"/>
+    <w:basedOn w:val="887"/>
     <w:uiPriority w:val="99"/>
     <w:pPr>
       <w:pBdr/>
@@ -19852,9 +20515,9 @@
       </w:tcPr>
     </w:tblStylePr>
   </w:style>
-  <w:style w:type="table" w:styleId="95">
+  <w:style w:type="table" w:styleId="784">
     <w:name w:val="List Table 4 - Accent 6"/>
-    <w:basedOn w:val="665"/>
+    <w:basedOn w:val="887"/>
     <w:uiPriority w:val="99"/>
     <w:pPr>
       <w:pBdr/>
@@ -20077,9 +20740,9 @@
       </w:tcPr>
     </w:tblStylePr>
   </w:style>
-  <w:style w:type="table" w:styleId="96">
+  <w:style w:type="table" w:styleId="785">
     <w:name w:val="List Table 5 Dark"/>
-    <w:basedOn w:val="665"/>
+    <w:basedOn w:val="887"/>
     <w:uiPriority w:val="99"/>
     <w:pPr>
       <w:pBdr/>
@@ -20319,9 +20982,9 @@
       </w:tcPr>
     </w:tblStylePr>
   </w:style>
-  <w:style w:type="table" w:styleId="97">
+  <w:style w:type="table" w:styleId="786">
     <w:name w:val="List Table 5 Dark - Accent 1"/>
-    <w:basedOn w:val="665"/>
+    <w:basedOn w:val="887"/>
     <w:uiPriority w:val="99"/>
     <w:pPr>
       <w:pBdr/>
@@ -20561,9 +21224,9 @@
       </w:tcPr>
     </w:tblStylePr>
   </w:style>
-  <w:style w:type="table" w:styleId="98">
+  <w:style w:type="table" w:styleId="787">
     <w:name w:val="List Table 5 Dark - Accent 2"/>
-    <w:basedOn w:val="665"/>
+    <w:basedOn w:val="887"/>
     <w:uiPriority w:val="99"/>
     <w:pPr>
       <w:pBdr/>
@@ -20803,9 +21466,9 @@
       </w:tcPr>
     </w:tblStylePr>
   </w:style>
-  <w:style w:type="table" w:styleId="99">
+  <w:style w:type="table" w:styleId="788">
     <w:name w:val="List Table 5 Dark - Accent 3"/>
-    <w:basedOn w:val="665"/>
+    <w:basedOn w:val="887"/>
     <w:uiPriority w:val="99"/>
     <w:pPr>
       <w:pBdr/>
@@ -21045,9 +21708,9 @@
       </w:tcPr>
     </w:tblStylePr>
   </w:style>
-  <w:style w:type="table" w:styleId="100">
+  <w:style w:type="table" w:styleId="789">
     <w:name w:val="List Table 5 Dark - Accent 4"/>
-    <w:basedOn w:val="665"/>
+    <w:basedOn w:val="887"/>
     <w:uiPriority w:val="99"/>
     <w:pPr>
       <w:pBdr/>
@@ -21287,9 +21950,9 @@
       </w:tcPr>
     </w:tblStylePr>
   </w:style>
-  <w:style w:type="table" w:styleId="101">
+  <w:style w:type="table" w:styleId="790">
     <w:name w:val="List Table 5 Dark - Accent 5"/>
-    <w:basedOn w:val="665"/>
+    <w:basedOn w:val="887"/>
     <w:uiPriority w:val="99"/>
     <w:pPr>
       <w:pBdr/>
@@ -21529,9 +22192,9 @@
       </w:tcPr>
     </w:tblStylePr>
   </w:style>
-  <w:style w:type="table" w:styleId="102">
+  <w:style w:type="table" w:styleId="791">
     <w:name w:val="List Table 5 Dark - Accent 6"/>
-    <w:basedOn w:val="665"/>
+    <w:basedOn w:val="887"/>
     <w:uiPriority w:val="99"/>
     <w:pPr>
       <w:pBdr/>
@@ -21771,9 +22434,9 @@
       </w:tcPr>
     </w:tblStylePr>
   </w:style>
-  <w:style w:type="table" w:styleId="103">
+  <w:style w:type="table" w:styleId="792">
     <w:name w:val="List Table 6 Colorful"/>
-    <w:basedOn w:val="665"/>
+    <w:basedOn w:val="887"/>
     <w:uiPriority w:val="99"/>
     <w:pPr>
       <w:pBdr/>
@@ -21994,9 +22657,9 @@
       </w:tcPr>
     </w:tblStylePr>
   </w:style>
-  <w:style w:type="table" w:styleId="104">
+  <w:style w:type="table" w:styleId="793">
     <w:name w:val="List Table 6 Colorful - Accent 1"/>
-    <w:basedOn w:val="665"/>
+    <w:basedOn w:val="887"/>
     <w:uiPriority w:val="99"/>
     <w:pPr>
       <w:pBdr/>
@@ -22217,9 +22880,9 @@
       </w:tcPr>
     </w:tblStylePr>
   </w:style>
-  <w:style w:type="table" w:styleId="105">
+  <w:style w:type="table" w:styleId="794">
     <w:name w:val="List Table 6 Colorful - Accent 2"/>
-    <w:basedOn w:val="665"/>
+    <w:basedOn w:val="887"/>
     <w:uiPriority w:val="99"/>
     <w:pPr>
       <w:pBdr/>
@@ -22440,9 +23103,9 @@
       </w:tcPr>
     </w:tblStylePr>
   </w:style>
-  <w:style w:type="table" w:styleId="106">
+  <w:style w:type="table" w:styleId="795">
     <w:name w:val="List Table 6 Colorful - Accent 3"/>
-    <w:basedOn w:val="665"/>
+    <w:basedOn w:val="887"/>
     <w:uiPriority w:val="99"/>
     <w:pPr>
       <w:pBdr/>
@@ -22663,9 +23326,9 @@
       </w:tcPr>
     </w:tblStylePr>
   </w:style>
-  <w:style w:type="table" w:styleId="107">
+  <w:style w:type="table" w:styleId="796">
     <w:name w:val="List Table 6 Colorful - Accent 4"/>
-    <w:basedOn w:val="665"/>
+    <w:basedOn w:val="887"/>
     <w:uiPriority w:val="99"/>
     <w:pPr>
       <w:pBdr/>
@@ -22886,9 +23549,9 @@
       </w:tcPr>
     </w:tblStylePr>
   </w:style>
-  <w:style w:type="table" w:styleId="108">
+  <w:style w:type="table" w:styleId="797">
     <w:name w:val="List Table 6 Colorful - Accent 5"/>
-    <w:basedOn w:val="665"/>
+    <w:basedOn w:val="887"/>
     <w:uiPriority w:val="99"/>
     <w:pPr>
       <w:pBdr/>
@@ -23109,9 +23772,9 @@
       </w:tcPr>
     </w:tblStylePr>
   </w:style>
-  <w:style w:type="table" w:styleId="109">
+  <w:style w:type="table" w:styleId="798">
     <w:name w:val="List Table 6 Colorful - Accent 6"/>
-    <w:basedOn w:val="665"/>
+    <w:basedOn w:val="887"/>
     <w:uiPriority w:val="99"/>
     <w:pPr>
       <w:pBdr/>
@@ -23332,9 +23995,9 @@
       </w:tcPr>
     </w:tblStylePr>
   </w:style>
-  <w:style w:type="table" w:styleId="110">
+  <w:style w:type="table" w:styleId="799">
     <w:name w:val="List Table 7 Colorful"/>
-    <w:basedOn w:val="665"/>
+    <w:basedOn w:val="887"/>
     <w:uiPriority w:val="99"/>
     <w:pPr>
       <w:pBdr/>
@@ -23433,11 +24096,11 @@
         <w:tblBorders/>
       </w:tblPr>
       <w:tcPr>
-        <w:shd w:color="ffffff"/>
+        <w:shd w:val="clear" w:color="ffffff"/>
         <w:tcBorders>
-          <w:top w:val="none"/>
-          <w:left w:val="none"/>
-          <w:bottom w:val="none"/>
+          <w:top w:val="none" w:color="000000" w:sz="4" w:space="0"/>
+          <w:left w:val="none" w:color="000000" w:sz="4" w:space="0"/>
+          <w:bottom w:val="none" w:color="000000" w:sz="4" w:space="0"/>
           <w:right w:val="single" w:color="000000" w:themeColor="text1" w:themeTint="80" w:sz="4" w:space="0"/>
         </w:tcBorders>
       </w:tcPr>
@@ -23460,10 +24123,10 @@
       <w:tcPr>
         <w:shd w:val="clear" w:color="ffffff" w:themeColor="light1" w:fill="ffffff" w:themeFill="light1"/>
         <w:tcBorders>
-          <w:top w:val="none"/>
-          <w:left w:val="none"/>
+          <w:top w:val="none" w:color="000000" w:sz="4" w:space="0"/>
+          <w:left w:val="none" w:color="000000" w:sz="4" w:space="0"/>
           <w:bottom w:val="single" w:color="000000" w:themeColor="text1" w:themeTint="80" w:sz="4" w:space="0"/>
-          <w:right w:val="none"/>
+          <w:right w:val="none" w:color="000000" w:sz="4" w:space="0"/>
         </w:tcBorders>
       </w:tcPr>
     </w:tblStylePr>
@@ -23483,12 +24146,12 @@
         <w:tblBorders/>
       </w:tblPr>
       <w:tcPr>
-        <w:shd w:color="ffffff"/>
+        <w:shd w:val="clear" w:color="ffffff"/>
         <w:tcBorders>
-          <w:top w:val="none"/>
+          <w:top w:val="none" w:color="000000" w:sz="4" w:space="0"/>
           <w:left w:val="single" w:color="000000" w:themeColor="text1" w:themeTint="80" w:sz="4" w:space="0"/>
-          <w:bottom w:val="none"/>
-          <w:right w:val="none"/>
+          <w:bottom w:val="none" w:color="000000" w:sz="4" w:space="0"/>
+          <w:right w:val="none" w:color="000000" w:sz="4" w:space="0"/>
         </w:tcBorders>
       </w:tcPr>
     </w:tblStylePr>
@@ -23511,9 +24174,9 @@
         <w:shd w:val="clear" w:color="ffffff" w:themeColor="light1" w:fill="ffffff" w:themeFill="light1"/>
         <w:tcBorders>
           <w:top w:val="single" w:color="000000" w:themeColor="text1" w:themeTint="80" w:sz="4" w:space="0"/>
-          <w:left w:val="none"/>
-          <w:bottom w:val="none"/>
-          <w:right w:val="none"/>
+          <w:left w:val="none" w:color="000000" w:sz="4" w:space="0"/>
+          <w:bottom w:val="none" w:color="000000" w:sz="4" w:space="0"/>
+          <w:right w:val="none" w:color="000000" w:sz="4" w:space="0"/>
         </w:tcBorders>
       </w:tcPr>
     </w:tblStylePr>
@@ -23588,9 +24251,9 @@
       </w:tcPr>
     </w:tblStylePr>
   </w:style>
-  <w:style w:type="table" w:styleId="111">
+  <w:style w:type="table" w:styleId="800">
     <w:name w:val="List Table 7 Colorful - Accent 1"/>
-    <w:basedOn w:val="665"/>
+    <w:basedOn w:val="887"/>
     <w:uiPriority w:val="99"/>
     <w:pPr>
       <w:pBdr/>
@@ -23689,11 +24352,11 @@
         <w:tblBorders/>
       </w:tblPr>
       <w:tcPr>
-        <w:shd w:color="ffffff"/>
+        <w:shd w:val="clear" w:color="ffffff"/>
         <w:tcBorders>
-          <w:top w:val="none"/>
-          <w:left w:val="none"/>
-          <w:bottom w:val="none"/>
+          <w:top w:val="none" w:color="000000" w:sz="4" w:space="0"/>
+          <w:left w:val="none" w:color="000000" w:sz="4" w:space="0"/>
+          <w:bottom w:val="none" w:color="000000" w:sz="4" w:space="0"/>
           <w:right w:val="single" w:color="000000" w:themeColor="accent1" w:sz="4" w:space="0"/>
         </w:tcBorders>
       </w:tcPr>
@@ -23716,10 +24379,10 @@
       <w:tcPr>
         <w:shd w:val="clear" w:color="ffffff" w:themeColor="light1" w:fill="ffffff" w:themeFill="light1"/>
         <w:tcBorders>
-          <w:top w:val="none"/>
-          <w:left w:val="none"/>
+          <w:top w:val="none" w:color="000000" w:sz="4" w:space="0"/>
+          <w:left w:val="none" w:color="000000" w:sz="4" w:space="0"/>
           <w:bottom w:val="single" w:color="000000" w:themeColor="accent1" w:sz="4" w:space="0"/>
-          <w:right w:val="none"/>
+          <w:right w:val="none" w:color="000000" w:sz="4" w:space="0"/>
         </w:tcBorders>
       </w:tcPr>
     </w:tblStylePr>
@@ -23739,12 +24402,12 @@
         <w:tblBorders/>
       </w:tblPr>
       <w:tcPr>
-        <w:shd w:color="ffffff"/>
+        <w:shd w:val="clear" w:color="ffffff"/>
         <w:tcBorders>
-          <w:top w:val="none"/>
+          <w:top w:val="none" w:color="000000" w:sz="4" w:space="0"/>
           <w:left w:val="single" w:color="000000" w:themeColor="accent1" w:sz="4" w:space="0"/>
-          <w:bottom w:val="none"/>
-          <w:right w:val="none"/>
+          <w:bottom w:val="none" w:color="000000" w:sz="4" w:space="0"/>
+          <w:right w:val="none" w:color="000000" w:sz="4" w:space="0"/>
         </w:tcBorders>
       </w:tcPr>
     </w:tblStylePr>
@@ -23767,9 +24430,9 @@
         <w:shd w:val="clear" w:color="ffffff" w:themeColor="light1" w:fill="ffffff" w:themeFill="light1"/>
         <w:tcBorders>
           <w:top w:val="single" w:color="000000" w:themeColor="accent1" w:sz="4" w:space="0"/>
-          <w:left w:val="none"/>
-          <w:bottom w:val="none"/>
-          <w:right w:val="none"/>
+          <w:left w:val="none" w:color="000000" w:sz="4" w:space="0"/>
+          <w:bottom w:val="none" w:color="000000" w:sz="4" w:space="0"/>
+          <w:right w:val="none" w:color="000000" w:sz="4" w:space="0"/>
         </w:tcBorders>
       </w:tcPr>
     </w:tblStylePr>
@@ -23844,9 +24507,9 @@
       </w:tcPr>
     </w:tblStylePr>
   </w:style>
-  <w:style w:type="table" w:styleId="112">
+  <w:style w:type="table" w:styleId="801">
     <w:name w:val="List Table 7 Colorful - Accent 2"/>
-    <w:basedOn w:val="665"/>
+    <w:basedOn w:val="887"/>
     <w:uiPriority w:val="99"/>
     <w:pPr>
       <w:pBdr/>
@@ -23945,11 +24608,11 @@
         <w:tblBorders/>
       </w:tblPr>
       <w:tcPr>
-        <w:shd w:color="ffffff"/>
+        <w:shd w:val="clear" w:color="ffffff"/>
         <w:tcBorders>
-          <w:top w:val="none"/>
-          <w:left w:val="none"/>
-          <w:bottom w:val="none"/>
+          <w:top w:val="none" w:color="000000" w:sz="4" w:space="0"/>
+          <w:left w:val="none" w:color="000000" w:sz="4" w:space="0"/>
+          <w:bottom w:val="none" w:color="000000" w:sz="4" w:space="0"/>
           <w:right w:val="single" w:color="000000" w:themeColor="accent2" w:themeTint="97" w:sz="4" w:space="0"/>
         </w:tcBorders>
       </w:tcPr>
@@ -23972,10 +24635,10 @@
       <w:tcPr>
         <w:shd w:val="clear" w:color="ffffff" w:themeColor="light1" w:fill="ffffff" w:themeFill="light1"/>
         <w:tcBorders>
-          <w:top w:val="none"/>
-          <w:left w:val="none"/>
+          <w:top w:val="none" w:color="000000" w:sz="4" w:space="0"/>
+          <w:left w:val="none" w:color="000000" w:sz="4" w:space="0"/>
           <w:bottom w:val="single" w:color="000000" w:themeColor="accent2" w:themeTint="97" w:sz="4" w:space="0"/>
-          <w:right w:val="none"/>
+          <w:right w:val="none" w:color="000000" w:sz="4" w:space="0"/>
         </w:tcBorders>
       </w:tcPr>
     </w:tblStylePr>
@@ -23995,12 +24658,12 @@
         <w:tblBorders/>
       </w:tblPr>
       <w:tcPr>
-        <w:shd w:color="ffffff"/>
+        <w:shd w:val="clear" w:color="ffffff"/>
         <w:tcBorders>
-          <w:top w:val="none"/>
+          <w:top w:val="none" w:color="000000" w:sz="4" w:space="0"/>
           <w:left w:val="single" w:color="000000" w:themeColor="accent2" w:themeTint="97" w:sz="4" w:space="0"/>
-          <w:bottom w:val="none"/>
-          <w:right w:val="none"/>
+          <w:bottom w:val="none" w:color="000000" w:sz="4" w:space="0"/>
+          <w:right w:val="none" w:color="000000" w:sz="4" w:space="0"/>
         </w:tcBorders>
       </w:tcPr>
     </w:tblStylePr>
@@ -24023,9 +24686,9 @@
         <w:shd w:val="clear" w:color="ffffff" w:themeColor="light1" w:fill="ffffff" w:themeFill="light1"/>
         <w:tcBorders>
           <w:top w:val="single" w:color="000000" w:themeColor="accent2" w:themeTint="97" w:sz="4" w:space="0"/>
-          <w:left w:val="none"/>
-          <w:bottom w:val="none"/>
-          <w:right w:val="none"/>
+          <w:left w:val="none" w:color="000000" w:sz="4" w:space="0"/>
+          <w:bottom w:val="none" w:color="000000" w:sz="4" w:space="0"/>
+          <w:right w:val="none" w:color="000000" w:sz="4" w:space="0"/>
         </w:tcBorders>
       </w:tcPr>
     </w:tblStylePr>
@@ -24100,9 +24763,9 @@
       </w:tcPr>
     </w:tblStylePr>
   </w:style>
-  <w:style w:type="table" w:styleId="113">
+  <w:style w:type="table" w:styleId="802">
     <w:name w:val="List Table 7 Colorful - Accent 3"/>
-    <w:basedOn w:val="665"/>
+    <w:basedOn w:val="887"/>
     <w:uiPriority w:val="99"/>
     <w:pPr>
       <w:pBdr/>
@@ -24201,11 +24864,11 @@
         <w:tblBorders/>
       </w:tblPr>
       <w:tcPr>
-        <w:shd w:color="ffffff"/>
+        <w:shd w:val="clear" w:color="ffffff"/>
         <w:tcBorders>
-          <w:top w:val="none"/>
-          <w:left w:val="none"/>
-          <w:bottom w:val="none"/>
+          <w:top w:val="none" w:color="000000" w:sz="4" w:space="0"/>
+          <w:left w:val="none" w:color="000000" w:sz="4" w:space="0"/>
+          <w:bottom w:val="none" w:color="000000" w:sz="4" w:space="0"/>
           <w:right w:val="single" w:color="000000" w:themeColor="accent3" w:themeTint="98" w:sz="4" w:space="0"/>
         </w:tcBorders>
       </w:tcPr>
@@ -24228,10 +24891,10 @@
       <w:tcPr>
         <w:shd w:val="clear" w:color="ffffff" w:themeColor="light1" w:fill="ffffff" w:themeFill="light1"/>
         <w:tcBorders>
-          <w:top w:val="none"/>
-          <w:left w:val="none"/>
+          <w:top w:val="none" w:color="000000" w:sz="4" w:space="0"/>
+          <w:left w:val="none" w:color="000000" w:sz="4" w:space="0"/>
           <w:bottom w:val="single" w:color="000000" w:themeColor="accent3" w:themeTint="98" w:sz="4" w:space="0"/>
-          <w:right w:val="none"/>
+          <w:right w:val="none" w:color="000000" w:sz="4" w:space="0"/>
         </w:tcBorders>
       </w:tcPr>
     </w:tblStylePr>
@@ -24251,12 +24914,12 @@
         <w:tblBorders/>
       </w:tblPr>
       <w:tcPr>
-        <w:shd w:color="ffffff"/>
+        <w:shd w:val="clear" w:color="ffffff"/>
         <w:tcBorders>
-          <w:top w:val="none"/>
+          <w:top w:val="none" w:color="000000" w:sz="4" w:space="0"/>
           <w:left w:val="single" w:color="000000" w:themeColor="accent3" w:themeTint="98" w:sz="4" w:space="0"/>
-          <w:bottom w:val="none"/>
-          <w:right w:val="none"/>
+          <w:bottom w:val="none" w:color="000000" w:sz="4" w:space="0"/>
+          <w:right w:val="none" w:color="000000" w:sz="4" w:space="0"/>
         </w:tcBorders>
       </w:tcPr>
     </w:tblStylePr>
@@ -24279,9 +24942,9 @@
         <w:shd w:val="clear" w:color="ffffff" w:themeColor="light1" w:fill="ffffff" w:themeFill="light1"/>
         <w:tcBorders>
           <w:top w:val="single" w:color="000000" w:themeColor="accent3" w:themeTint="98" w:sz="4" w:space="0"/>
-          <w:left w:val="none"/>
-          <w:bottom w:val="none"/>
-          <w:right w:val="none"/>
+          <w:left w:val="none" w:color="000000" w:sz="4" w:space="0"/>
+          <w:bottom w:val="none" w:color="000000" w:sz="4" w:space="0"/>
+          <w:right w:val="none" w:color="000000" w:sz="4" w:space="0"/>
         </w:tcBorders>
       </w:tcPr>
     </w:tblStylePr>
@@ -24356,9 +25019,9 @@
       </w:tcPr>
     </w:tblStylePr>
   </w:style>
-  <w:style w:type="table" w:styleId="114">
+  <w:style w:type="table" w:styleId="803">
     <w:name w:val="List Table 7 Colorful - Accent 4"/>
-    <w:basedOn w:val="665"/>
+    <w:basedOn w:val="887"/>
     <w:uiPriority w:val="99"/>
     <w:pPr>
       <w:pBdr/>
@@ -24457,11 +25120,11 @@
         <w:tblBorders/>
       </w:tblPr>
       <w:tcPr>
-        <w:shd w:color="ffffff"/>
+        <w:shd w:val="clear" w:color="ffffff"/>
         <w:tcBorders>
-          <w:top w:val="none"/>
-          <w:left w:val="none"/>
-          <w:bottom w:val="none"/>
+          <w:top w:val="none" w:color="000000" w:sz="4" w:space="0"/>
+          <w:left w:val="none" w:color="000000" w:sz="4" w:space="0"/>
+          <w:bottom w:val="none" w:color="000000" w:sz="4" w:space="0"/>
           <w:right w:val="single" w:color="000000" w:themeColor="accent4" w:themeTint="9A" w:sz="4" w:space="0"/>
         </w:tcBorders>
       </w:tcPr>
@@ -24484,10 +25147,10 @@
       <w:tcPr>
         <w:shd w:val="clear" w:color="ffffff" w:themeColor="light1" w:fill="ffffff" w:themeFill="light1"/>
         <w:tcBorders>
-          <w:top w:val="none"/>
-          <w:left w:val="none"/>
+          <w:top w:val="none" w:color="000000" w:sz="4" w:space="0"/>
+          <w:left w:val="none" w:color="000000" w:sz="4" w:space="0"/>
           <w:bottom w:val="single" w:color="000000" w:themeColor="accent4" w:themeTint="9A" w:sz="4" w:space="0"/>
-          <w:right w:val="none"/>
+          <w:right w:val="none" w:color="000000" w:sz="4" w:space="0"/>
         </w:tcBorders>
       </w:tcPr>
     </w:tblStylePr>
@@ -24507,12 +25170,12 @@
         <w:tblBorders/>
       </w:tblPr>
       <w:tcPr>
-        <w:shd w:color="ffffff"/>
+        <w:shd w:val="clear" w:color="ffffff"/>
         <w:tcBorders>
-          <w:top w:val="none"/>
+          <w:top w:val="none" w:color="000000" w:sz="4" w:space="0"/>
           <w:left w:val="single" w:color="000000" w:themeColor="accent4" w:themeTint="9A" w:sz="4" w:space="0"/>
-          <w:bottom w:val="none"/>
-          <w:right w:val="none"/>
+          <w:bottom w:val="none" w:color="000000" w:sz="4" w:space="0"/>
+          <w:right w:val="none" w:color="000000" w:sz="4" w:space="0"/>
         </w:tcBorders>
       </w:tcPr>
     </w:tblStylePr>
@@ -24535,9 +25198,9 @@
         <w:shd w:val="clear" w:color="ffffff" w:themeColor="light1" w:fill="ffffff" w:themeFill="light1"/>
         <w:tcBorders>
           <w:top w:val="single" w:color="000000" w:themeColor="accent4" w:themeTint="9A" w:sz="4" w:space="0"/>
-          <w:left w:val="none"/>
-          <w:bottom w:val="none"/>
-          <w:right w:val="none"/>
+          <w:left w:val="none" w:color="000000" w:sz="4" w:space="0"/>
+          <w:bottom w:val="none" w:color="000000" w:sz="4" w:space="0"/>
+          <w:right w:val="none" w:color="000000" w:sz="4" w:space="0"/>
         </w:tcBorders>
       </w:tcPr>
     </w:tblStylePr>
@@ -24612,9 +25275,9 @@
       </w:tcPr>
     </w:tblStylePr>
   </w:style>
-  <w:style w:type="table" w:styleId="115">
+  <w:style w:type="table" w:styleId="804">
     <w:name w:val="List Table 7 Colorful - Accent 5"/>
-    <w:basedOn w:val="665"/>
+    <w:basedOn w:val="887"/>
     <w:uiPriority w:val="99"/>
     <w:pPr>
       <w:pBdr/>
@@ -24713,11 +25376,11 @@
         <w:tblBorders/>
       </w:tblPr>
       <w:tcPr>
-        <w:shd w:color="ffffff"/>
+        <w:shd w:val="clear" w:color="ffffff"/>
         <w:tcBorders>
-          <w:top w:val="none"/>
-          <w:left w:val="none"/>
-          <w:bottom w:val="none"/>
+          <w:top w:val="none" w:color="000000" w:sz="4" w:space="0"/>
+          <w:left w:val="none" w:color="000000" w:sz="4" w:space="0"/>
+          <w:bottom w:val="none" w:color="000000" w:sz="4" w:space="0"/>
           <w:right w:val="single" w:color="000000" w:themeColor="accent5" w:themeTint="9A" w:sz="4" w:space="0"/>
         </w:tcBorders>
       </w:tcPr>
@@ -24740,10 +25403,10 @@
       <w:tcPr>
         <w:shd w:val="clear" w:color="ffffff" w:themeColor="light1" w:fill="ffffff" w:themeFill="light1"/>
         <w:tcBorders>
-          <w:top w:val="none"/>
-          <w:left w:val="none"/>
+          <w:top w:val="none" w:color="000000" w:sz="4" w:space="0"/>
+          <w:left w:val="none" w:color="000000" w:sz="4" w:space="0"/>
           <w:bottom w:val="single" w:color="000000" w:themeColor="accent5" w:themeTint="9A" w:sz="4" w:space="0"/>
-          <w:right w:val="none"/>
+          <w:right w:val="none" w:color="000000" w:sz="4" w:space="0"/>
         </w:tcBorders>
       </w:tcPr>
     </w:tblStylePr>
@@ -24763,12 +25426,12 @@
         <w:tblBorders/>
       </w:tblPr>
       <w:tcPr>
-        <w:shd w:color="ffffff"/>
+        <w:shd w:val="clear" w:color="ffffff"/>
         <w:tcBorders>
-          <w:top w:val="none"/>
+          <w:top w:val="none" w:color="000000" w:sz="4" w:space="0"/>
           <w:left w:val="single" w:color="000000" w:themeColor="accent5" w:themeTint="9A" w:sz="4" w:space="0"/>
-          <w:bottom w:val="none"/>
-          <w:right w:val="none"/>
+          <w:bottom w:val="none" w:color="000000" w:sz="4" w:space="0"/>
+          <w:right w:val="none" w:color="000000" w:sz="4" w:space="0"/>
         </w:tcBorders>
       </w:tcPr>
     </w:tblStylePr>
@@ -24791,9 +25454,9 @@
         <w:shd w:val="clear" w:color="ffffff" w:themeColor="light1" w:fill="ffffff" w:themeFill="light1"/>
         <w:tcBorders>
           <w:top w:val="single" w:color="000000" w:themeColor="accent5" w:themeTint="9A" w:sz="4" w:space="0"/>
-          <w:left w:val="none"/>
-          <w:bottom w:val="none"/>
-          <w:right w:val="none"/>
+          <w:left w:val="none" w:color="000000" w:sz="4" w:space="0"/>
+          <w:bottom w:val="none" w:color="000000" w:sz="4" w:space="0"/>
+          <w:right w:val="none" w:color="000000" w:sz="4" w:space="0"/>
         </w:tcBorders>
       </w:tcPr>
     </w:tblStylePr>
@@ -24868,9 +25531,9 @@
       </w:tcPr>
     </w:tblStylePr>
   </w:style>
-  <w:style w:type="table" w:styleId="116">
+  <w:style w:type="table" w:styleId="805">
     <w:name w:val="List Table 7 Colorful - Accent 6"/>
-    <w:basedOn w:val="665"/>
+    <w:basedOn w:val="887"/>
     <w:uiPriority w:val="99"/>
     <w:pPr>
       <w:pBdr/>
@@ -24969,11 +25632,11 @@
         <w:tblBorders/>
       </w:tblPr>
       <w:tcPr>
-        <w:shd w:color="ffffff"/>
+        <w:shd w:val="clear" w:color="ffffff"/>
         <w:tcBorders>
-          <w:top w:val="none"/>
-          <w:left w:val="none"/>
-          <w:bottom w:val="none"/>
+          <w:top w:val="none" w:color="000000" w:sz="4" w:space="0"/>
+          <w:left w:val="none" w:color="000000" w:sz="4" w:space="0"/>
+          <w:bottom w:val="none" w:color="000000" w:sz="4" w:space="0"/>
           <w:right w:val="single" w:color="000000" w:themeColor="accent6" w:themeTint="98" w:sz="4" w:space="0"/>
         </w:tcBorders>
       </w:tcPr>
@@ -24996,10 +25659,10 @@
       <w:tcPr>
         <w:shd w:val="clear" w:color="ffffff" w:themeColor="light1" w:fill="ffffff" w:themeFill="light1"/>
         <w:tcBorders>
-          <w:top w:val="none"/>
-          <w:left w:val="none"/>
+          <w:top w:val="none" w:color="000000" w:sz="4" w:space="0"/>
+          <w:left w:val="none" w:color="000000" w:sz="4" w:space="0"/>
           <w:bottom w:val="single" w:color="000000" w:themeColor="accent6" w:themeTint="98" w:sz="4" w:space="0"/>
-          <w:right w:val="none"/>
+          <w:right w:val="none" w:color="000000" w:sz="4" w:space="0"/>
         </w:tcBorders>
       </w:tcPr>
     </w:tblStylePr>
@@ -25019,12 +25682,12 @@
         <w:tblBorders/>
       </w:tblPr>
       <w:tcPr>
-        <w:shd w:color="ffffff"/>
+        <w:shd w:val="clear" w:color="ffffff"/>
         <w:tcBorders>
-          <w:top w:val="none"/>
+          <w:top w:val="none" w:color="000000" w:sz="4" w:space="0"/>
           <w:left w:val="single" w:color="000000" w:themeColor="accent6" w:themeTint="98" w:sz="4" w:space="0"/>
-          <w:bottom w:val="none"/>
-          <w:right w:val="none"/>
+          <w:bottom w:val="none" w:color="000000" w:sz="4" w:space="0"/>
+          <w:right w:val="none" w:color="000000" w:sz="4" w:space="0"/>
         </w:tcBorders>
       </w:tcPr>
     </w:tblStylePr>
@@ -25047,9 +25710,9 @@
         <w:shd w:val="clear" w:color="ffffff" w:themeColor="light1" w:fill="ffffff" w:themeFill="light1"/>
         <w:tcBorders>
           <w:top w:val="single" w:color="000000" w:themeColor="accent6" w:themeTint="98" w:sz="4" w:space="0"/>
-          <w:left w:val="none"/>
-          <w:bottom w:val="none"/>
-          <w:right w:val="none"/>
+          <w:left w:val="none" w:color="000000" w:sz="4" w:space="0"/>
+          <w:bottom w:val="none" w:color="000000" w:sz="4" w:space="0"/>
+          <w:right w:val="none" w:color="000000" w:sz="4" w:space="0"/>
         </w:tcBorders>
       </w:tcPr>
     </w:tblStylePr>
@@ -25124,9 +25787,9 @@
       </w:tcPr>
     </w:tblStylePr>
   </w:style>
-  <w:style w:type="table" w:styleId="117">
+  <w:style w:type="table" w:styleId="806">
     <w:name w:val="Lined - Accent"/>
-    <w:basedOn w:val="665"/>
+    <w:basedOn w:val="887"/>
     <w:uiPriority w:val="99"/>
     <w:pPr>
       <w:pBdr/>
@@ -25361,9 +26024,9 @@
       </w:tcPr>
     </w:tblStylePr>
   </w:style>
-  <w:style w:type="table" w:styleId="118">
+  <w:style w:type="table" w:styleId="807">
     <w:name w:val="Lined - Accent 1"/>
-    <w:basedOn w:val="665"/>
+    <w:basedOn w:val="887"/>
     <w:uiPriority w:val="99"/>
     <w:pPr>
       <w:pBdr/>
@@ -25598,9 +26261,9 @@
       </w:tcPr>
     </w:tblStylePr>
   </w:style>
-  <w:style w:type="table" w:styleId="119">
+  <w:style w:type="table" w:styleId="808">
     <w:name w:val="Lined - Accent 2"/>
-    <w:basedOn w:val="665"/>
+    <w:basedOn w:val="887"/>
     <w:uiPriority w:val="99"/>
     <w:pPr>
       <w:pBdr/>
@@ -25835,9 +26498,9 @@
       </w:tcPr>
     </w:tblStylePr>
   </w:style>
-  <w:style w:type="table" w:styleId="120">
+  <w:style w:type="table" w:styleId="809">
     <w:name w:val="Lined - Accent 3"/>
-    <w:basedOn w:val="665"/>
+    <w:basedOn w:val="887"/>
     <w:uiPriority w:val="99"/>
     <w:pPr>
       <w:pBdr/>
@@ -26072,9 +26735,9 @@
       </w:tcPr>
     </w:tblStylePr>
   </w:style>
-  <w:style w:type="table" w:styleId="121">
+  <w:style w:type="table" w:styleId="810">
     <w:name w:val="Lined - Accent 4"/>
-    <w:basedOn w:val="665"/>
+    <w:basedOn w:val="887"/>
     <w:uiPriority w:val="99"/>
     <w:pPr>
       <w:pBdr/>
@@ -26309,9 +26972,9 @@
       </w:tcPr>
     </w:tblStylePr>
   </w:style>
-  <w:style w:type="table" w:styleId="122">
+  <w:style w:type="table" w:styleId="811">
     <w:name w:val="Lined - Accent 5"/>
-    <w:basedOn w:val="665"/>
+    <w:basedOn w:val="887"/>
     <w:uiPriority w:val="99"/>
     <w:pPr>
       <w:pBdr/>
@@ -26546,9 +27209,9 @@
       </w:tcPr>
     </w:tblStylePr>
   </w:style>
-  <w:style w:type="table" w:styleId="123">
+  <w:style w:type="table" w:styleId="812">
     <w:name w:val="Lined - Accent 6"/>
-    <w:basedOn w:val="665"/>
+    <w:basedOn w:val="887"/>
     <w:uiPriority w:val="99"/>
     <w:pPr>
       <w:pBdr/>
@@ -26783,9 +27446,9 @@
       </w:tcPr>
     </w:tblStylePr>
   </w:style>
-  <w:style w:type="table" w:styleId="124">
+  <w:style w:type="table" w:styleId="813">
     <w:name w:val="Bordered &amp; Lined - Accent"/>
-    <w:basedOn w:val="665"/>
+    <w:basedOn w:val="887"/>
     <w:uiPriority w:val="99"/>
     <w:pPr>
       <w:pBdr/>
@@ -27027,9 +27690,9 @@
       </w:tcPr>
     </w:tblStylePr>
   </w:style>
-  <w:style w:type="table" w:styleId="125">
+  <w:style w:type="table" w:styleId="814">
     <w:name w:val="Bordered &amp; Lined - Accent 1"/>
-    <w:basedOn w:val="665"/>
+    <w:basedOn w:val="887"/>
     <w:uiPriority w:val="99"/>
     <w:pPr>
       <w:pBdr/>
@@ -27271,9 +27934,9 @@
       </w:tcPr>
     </w:tblStylePr>
   </w:style>
-  <w:style w:type="table" w:styleId="126">
+  <w:style w:type="table" w:styleId="815">
     <w:name w:val="Bordered &amp; Lined - Accent 2"/>
-    <w:basedOn w:val="665"/>
+    <w:basedOn w:val="887"/>
     <w:uiPriority w:val="99"/>
     <w:pPr>
       <w:pBdr/>
@@ -27515,9 +28178,9 @@
       </w:tcPr>
     </w:tblStylePr>
   </w:style>
-  <w:style w:type="table" w:styleId="127">
+  <w:style w:type="table" w:styleId="816">
     <w:name w:val="Bordered &amp; Lined - Accent 3"/>
-    <w:basedOn w:val="665"/>
+    <w:basedOn w:val="887"/>
     <w:uiPriority w:val="99"/>
     <w:pPr>
       <w:pBdr/>
@@ -27759,9 +28422,9 @@
       </w:tcPr>
     </w:tblStylePr>
   </w:style>
-  <w:style w:type="table" w:styleId="128">
+  <w:style w:type="table" w:styleId="817">
     <w:name w:val="Bordered &amp; Lined - Accent 4"/>
-    <w:basedOn w:val="665"/>
+    <w:basedOn w:val="887"/>
     <w:uiPriority w:val="99"/>
     <w:pPr>
       <w:pBdr/>
@@ -28003,9 +28666,9 @@
       </w:tcPr>
     </w:tblStylePr>
   </w:style>
-  <w:style w:type="table" w:styleId="129">
+  <w:style w:type="table" w:styleId="818">
     <w:name w:val="Bordered &amp; Lined - Accent 5"/>
-    <w:basedOn w:val="665"/>
+    <w:basedOn w:val="887"/>
     <w:uiPriority w:val="99"/>
     <w:pPr>
       <w:pBdr/>
@@ -28247,9 +28910,9 @@
       </w:tcPr>
     </w:tblStylePr>
   </w:style>
-  <w:style w:type="table" w:styleId="130">
+  <w:style w:type="table" w:styleId="819">
     <w:name w:val="Bordered &amp; Lined - Accent 6"/>
-    <w:basedOn w:val="665"/>
+    <w:basedOn w:val="887"/>
     <w:uiPriority w:val="99"/>
     <w:pPr>
       <w:pBdr/>
@@ -28491,9 +29154,9 @@
       </w:tcPr>
     </w:tblStylePr>
   </w:style>
-  <w:style w:type="table" w:styleId="131">
+  <w:style w:type="table" w:styleId="820">
     <w:name w:val="Bordered"/>
-    <w:basedOn w:val="665"/>
+    <w:basedOn w:val="887"/>
     <w:uiPriority w:val="99"/>
     <w:pPr>
       <w:pBdr/>
@@ -28722,9 +29385,9 @@
       </w:tcPr>
     </w:tblStylePr>
   </w:style>
-  <w:style w:type="table" w:styleId="132">
+  <w:style w:type="table" w:styleId="821">
     <w:name w:val="Bordered - Accent 1"/>
-    <w:basedOn w:val="665"/>
+    <w:basedOn w:val="887"/>
     <w:uiPriority w:val="99"/>
     <w:pPr>
       <w:pBdr/>
@@ -28953,9 +29616,9 @@
       </w:tcPr>
     </w:tblStylePr>
   </w:style>
-  <w:style w:type="table" w:styleId="133">
+  <w:style w:type="table" w:styleId="822">
     <w:name w:val="Bordered - Accent 2"/>
-    <w:basedOn w:val="665"/>
+    <w:basedOn w:val="887"/>
     <w:uiPriority w:val="99"/>
     <w:pPr>
       <w:pBdr/>
@@ -29184,9 +29847,9 @@
       </w:tcPr>
     </w:tblStylePr>
   </w:style>
-  <w:style w:type="table" w:styleId="134">
+  <w:style w:type="table" w:styleId="823">
     <w:name w:val="Bordered - Accent 3"/>
-    <w:basedOn w:val="665"/>
+    <w:basedOn w:val="887"/>
     <w:uiPriority w:val="99"/>
     <w:pPr>
       <w:pBdr/>
@@ -29415,9 +30078,9 @@
       </w:tcPr>
     </w:tblStylePr>
   </w:style>
-  <w:style w:type="table" w:styleId="135">
+  <w:style w:type="table" w:styleId="824">
     <w:name w:val="Bordered - Accent 4"/>
-    <w:basedOn w:val="665"/>
+    <w:basedOn w:val="887"/>
     <w:uiPriority w:val="99"/>
     <w:pPr>
       <w:pBdr/>
@@ -29646,9 +30309,9 @@
       </w:tcPr>
     </w:tblStylePr>
   </w:style>
-  <w:style w:type="table" w:styleId="136">
+  <w:style w:type="table" w:styleId="825">
     <w:name w:val="Bordered - Accent 5"/>
-    <w:basedOn w:val="665"/>
+    <w:basedOn w:val="887"/>
     <w:uiPriority w:val="99"/>
     <w:pPr>
       <w:pBdr/>
@@ -29877,9 +30540,9 @@
       </w:tcPr>
     </w:tblStylePr>
   </w:style>
-  <w:style w:type="table" w:styleId="137">
+  <w:style w:type="table" w:styleId="826">
     <w:name w:val="Bordered - Accent 6"/>
-    <w:basedOn w:val="665"/>
+    <w:basedOn w:val="887"/>
     <w:uiPriority w:val="99"/>
     <w:pPr>
       <w:pBdr/>
@@ -30108,11 +30771,11 @@
       </w:tcPr>
     </w:tblStylePr>
   </w:style>
-  <w:style w:type="paragraph" w:styleId="139">
+  <w:style w:type="paragraph" w:styleId="827">
     <w:name w:val="Heading 1"/>
-    <w:basedOn w:val="664"/>
-    <w:next w:val="664"/>
-    <w:link w:val="150"/>
+    <w:basedOn w:val="886"/>
+    <w:next w:val="886"/>
+    <w:link w:val="837"/>
     <w:uiPriority w:val="9"/>
     <w:qFormat/>
     <w:pPr>
@@ -30130,11 +30793,11 @@
       <w:szCs w:val="40"/>
     </w:rPr>
   </w:style>
-  <w:style w:type="paragraph" w:styleId="140">
+  <w:style w:type="paragraph" w:styleId="828">
     <w:name w:val="Heading 2"/>
-    <w:basedOn w:val="664"/>
-    <w:next w:val="664"/>
-    <w:link w:val="151"/>
+    <w:basedOn w:val="886"/>
+    <w:next w:val="886"/>
+    <w:link w:val="838"/>
     <w:uiPriority w:val="9"/>
     <w:unhideWhenUsed/>
     <w:qFormat/>
@@ -30153,11 +30816,11 @@
       <w:szCs w:val="32"/>
     </w:rPr>
   </w:style>
-  <w:style w:type="paragraph" w:styleId="141">
+  <w:style w:type="paragraph" w:styleId="829">
     <w:name w:val="Heading 3"/>
-    <w:basedOn w:val="664"/>
-    <w:next w:val="664"/>
-    <w:link w:val="152"/>
+    <w:basedOn w:val="886"/>
+    <w:next w:val="886"/>
+    <w:link w:val="839"/>
     <w:uiPriority w:val="9"/>
     <w:unhideWhenUsed/>
     <w:qFormat/>
@@ -30176,11 +30839,11 @@
       <w:szCs w:val="28"/>
     </w:rPr>
   </w:style>
-  <w:style w:type="paragraph" w:styleId="142">
+  <w:style w:type="paragraph" w:styleId="830">
     <w:name w:val="Heading 4"/>
-    <w:basedOn w:val="664"/>
-    <w:next w:val="664"/>
-    <w:link w:val="153"/>
+    <w:basedOn w:val="886"/>
+    <w:next w:val="886"/>
+    <w:link w:val="840"/>
     <w:uiPriority w:val="9"/>
     <w:unhideWhenUsed/>
     <w:qFormat/>
@@ -30199,11 +30862,11 @@
       <w:color w:val="0f4761" w:themeColor="accent1" w:themeShade="BF"/>
     </w:rPr>
   </w:style>
-  <w:style w:type="paragraph" w:styleId="143">
+  <w:style w:type="paragraph" w:styleId="831">
     <w:name w:val="Heading 5"/>
-    <w:basedOn w:val="664"/>
-    <w:next w:val="664"/>
-    <w:link w:val="154"/>
+    <w:basedOn w:val="886"/>
+    <w:next w:val="886"/>
+    <w:link w:val="841"/>
     <w:uiPriority w:val="9"/>
     <w:unhideWhenUsed/>
     <w:qFormat/>
@@ -30220,11 +30883,11 @@
       <w:color w:val="0f4761" w:themeColor="accent1" w:themeShade="BF"/>
     </w:rPr>
   </w:style>
-  <w:style w:type="paragraph" w:styleId="144">
+  <w:style w:type="paragraph" w:styleId="832">
     <w:name w:val="Heading 6"/>
-    <w:basedOn w:val="664"/>
-    <w:next w:val="664"/>
-    <w:link w:val="155"/>
+    <w:basedOn w:val="886"/>
+    <w:next w:val="886"/>
+    <w:link w:val="842"/>
     <w:uiPriority w:val="9"/>
     <w:unhideWhenUsed/>
     <w:qFormat/>
@@ -30243,11 +30906,11 @@
       <w:color w:val="595959" w:themeColor="text1" w:themeTint="A6"/>
     </w:rPr>
   </w:style>
-  <w:style w:type="paragraph" w:styleId="145">
+  <w:style w:type="paragraph" w:styleId="833">
     <w:name w:val="Heading 7"/>
-    <w:basedOn w:val="664"/>
-    <w:next w:val="664"/>
-    <w:link w:val="156"/>
+    <w:basedOn w:val="886"/>
+    <w:next w:val="886"/>
+    <w:link w:val="843"/>
     <w:uiPriority w:val="9"/>
     <w:unhideWhenUsed/>
     <w:qFormat/>
@@ -30264,11 +30927,11 @@
       <w:color w:val="595959" w:themeColor="text1" w:themeTint="A6"/>
     </w:rPr>
   </w:style>
-  <w:style w:type="paragraph" w:styleId="146">
+  <w:style w:type="paragraph" w:styleId="834">
     <w:name w:val="Heading 8"/>
-    <w:basedOn w:val="664"/>
-    <w:next w:val="664"/>
-    <w:link w:val="157"/>
+    <w:basedOn w:val="886"/>
+    <w:next w:val="886"/>
+    <w:link w:val="844"/>
     <w:uiPriority w:val="9"/>
     <w:unhideWhenUsed/>
     <w:qFormat/>
@@ -30287,11 +30950,11 @@
       <w:color w:val="272727" w:themeColor="text1" w:themeTint="D8"/>
     </w:rPr>
   </w:style>
-  <w:style w:type="paragraph" w:styleId="147">
+  <w:style w:type="paragraph" w:styleId="835">
     <w:name w:val="Heading 9"/>
-    <w:basedOn w:val="664"/>
-    <w:next w:val="664"/>
-    <w:link w:val="158"/>
+    <w:basedOn w:val="886"/>
+    <w:next w:val="886"/>
+    <w:link w:val="845"/>
     <w:uiPriority w:val="9"/>
     <w:unhideWhenUsed/>
     <w:qFormat/>
@@ -30310,7 +30973,7 @@
       <w:color w:val="272727" w:themeColor="text1" w:themeTint="D8"/>
     </w:rPr>
   </w:style>
-  <w:style w:type="character" w:styleId="148" w:default="1">
+  <w:style w:type="character" w:styleId="836" w:default="1">
     <w:name w:val="Default Paragraph Font"/>
     <w:uiPriority w:val="1"/>
     <w:semiHidden/>
@@ -30321,10 +30984,10 @@
       <w:ind/>
     </w:pPr>
   </w:style>
-  <w:style w:type="character" w:styleId="150">
+  <w:style w:type="character" w:styleId="837">
     <w:name w:val="Heading 1 Char"/>
-    <w:basedOn w:val="148"/>
-    <w:link w:val="139"/>
+    <w:basedOn w:val="836"/>
+    <w:link w:val="827"/>
     <w:uiPriority w:val="9"/>
     <w:pPr>
       <w:pBdr/>
@@ -30338,10 +31001,10 @@
       <w:szCs w:val="40"/>
     </w:rPr>
   </w:style>
-  <w:style w:type="character" w:styleId="151">
+  <w:style w:type="character" w:styleId="838">
     <w:name w:val="Heading 2 Char"/>
-    <w:basedOn w:val="148"/>
-    <w:link w:val="140"/>
+    <w:basedOn w:val="836"/>
+    <w:link w:val="828"/>
     <w:uiPriority w:val="9"/>
     <w:pPr>
       <w:pBdr/>
@@ -30355,10 +31018,10 @@
       <w:szCs w:val="32"/>
     </w:rPr>
   </w:style>
-  <w:style w:type="character" w:styleId="152">
+  <w:style w:type="character" w:styleId="839">
     <w:name w:val="Heading 3 Char"/>
-    <w:basedOn w:val="148"/>
-    <w:link w:val="141"/>
+    <w:basedOn w:val="836"/>
+    <w:link w:val="829"/>
     <w:uiPriority w:val="9"/>
     <w:pPr>
       <w:pBdr/>
@@ -30372,10 +31035,10 @@
       <w:szCs w:val="28"/>
     </w:rPr>
   </w:style>
-  <w:style w:type="character" w:styleId="153">
+  <w:style w:type="character" w:styleId="840">
     <w:name w:val="Heading 4 Char"/>
-    <w:basedOn w:val="148"/>
-    <w:link w:val="142"/>
+    <w:basedOn w:val="836"/>
+    <w:link w:val="830"/>
     <w:uiPriority w:val="9"/>
     <w:pPr>
       <w:pBdr/>
@@ -30389,10 +31052,10 @@
       <w:color w:val="0f4761" w:themeColor="accent1" w:themeShade="BF"/>
     </w:rPr>
   </w:style>
-  <w:style w:type="character" w:styleId="154">
+  <w:style w:type="character" w:styleId="841">
     <w:name w:val="Heading 5 Char"/>
-    <w:basedOn w:val="148"/>
-    <w:link w:val="143"/>
+    <w:basedOn w:val="836"/>
+    <w:link w:val="831"/>
     <w:uiPriority w:val="9"/>
     <w:pPr>
       <w:pBdr/>
@@ -30404,10 +31067,10 @@
       <w:color w:val="0f4761" w:themeColor="accent1" w:themeShade="BF"/>
     </w:rPr>
   </w:style>
-  <w:style w:type="character" w:styleId="155">
+  <w:style w:type="character" w:styleId="842">
     <w:name w:val="Heading 6 Char"/>
-    <w:basedOn w:val="148"/>
-    <w:link w:val="144"/>
+    <w:basedOn w:val="836"/>
+    <w:link w:val="832"/>
     <w:uiPriority w:val="9"/>
     <w:pPr>
       <w:pBdr/>
@@ -30421,10 +31084,10 @@
       <w:color w:val="595959" w:themeColor="text1" w:themeTint="A6"/>
     </w:rPr>
   </w:style>
-  <w:style w:type="character" w:styleId="156">
+  <w:style w:type="character" w:styleId="843">
     <w:name w:val="Heading 7 Char"/>
-    <w:basedOn w:val="148"/>
-    <w:link w:val="145"/>
+    <w:basedOn w:val="836"/>
+    <w:link w:val="833"/>
     <w:uiPriority w:val="9"/>
     <w:pPr>
       <w:pBdr/>
@@ -30436,10 +31099,10 @@
       <w:color w:val="595959" w:themeColor="text1" w:themeTint="A6"/>
     </w:rPr>
   </w:style>
-  <w:style w:type="character" w:styleId="157">
+  <w:style w:type="character" w:styleId="844">
     <w:name w:val="Heading 8 Char"/>
-    <w:basedOn w:val="148"/>
-    <w:link w:val="146"/>
+    <w:basedOn w:val="836"/>
+    <w:link w:val="834"/>
     <w:uiPriority w:val="9"/>
     <w:pPr>
       <w:pBdr/>
@@ -30453,10 +31116,10 @@
       <w:color w:val="272727" w:themeColor="text1" w:themeTint="D8"/>
     </w:rPr>
   </w:style>
-  <w:style w:type="character" w:styleId="158">
+  <w:style w:type="character" w:styleId="845">
     <w:name w:val="Heading 9 Char"/>
-    <w:basedOn w:val="148"/>
-    <w:link w:val="147"/>
+    <w:basedOn w:val="836"/>
+    <w:link w:val="835"/>
     <w:uiPriority w:val="9"/>
     <w:pPr>
       <w:pBdr/>
@@ -30470,11 +31133,11 @@
       <w:color w:val="272727" w:themeColor="text1" w:themeTint="D8"/>
     </w:rPr>
   </w:style>
-  <w:style w:type="paragraph" w:styleId="159">
+  <w:style w:type="paragraph" w:styleId="846">
     <w:name w:val="Title"/>
-    <w:basedOn w:val="664"/>
-    <w:next w:val="664"/>
-    <w:link w:val="160"/>
+    <w:basedOn w:val="886"/>
+    <w:next w:val="886"/>
+    <w:link w:val="847"/>
     <w:uiPriority w:val="10"/>
     <w:qFormat/>
     <w:pPr>
@@ -30490,10 +31153,10 @@
       <w:szCs w:val="56"/>
     </w:rPr>
   </w:style>
-  <w:style w:type="character" w:styleId="160">
+  <w:style w:type="character" w:styleId="847">
     <w:name w:val="Title Char"/>
-    <w:basedOn w:val="148"/>
-    <w:link w:val="159"/>
+    <w:basedOn w:val="836"/>
+    <w:link w:val="846"/>
     <w:uiPriority w:val="10"/>
     <w:pPr>
       <w:pBdr/>
@@ -30507,11 +31170,11 @@
       <w:szCs w:val="56"/>
     </w:rPr>
   </w:style>
-  <w:style w:type="paragraph" w:styleId="161">
+  <w:style w:type="paragraph" w:styleId="848">
     <w:name w:val="Subtitle"/>
-    <w:basedOn w:val="664"/>
-    <w:next w:val="664"/>
-    <w:link w:val="162"/>
+    <w:basedOn w:val="886"/>
+    <w:next w:val="886"/>
+    <w:link w:val="849"/>
     <w:uiPriority w:val="11"/>
     <w:qFormat/>
     <w:pPr>
@@ -30529,10 +31192,10 @@
       <w:szCs w:val="28"/>
     </w:rPr>
   </w:style>
-  <w:style w:type="character" w:styleId="162">
+  <w:style w:type="character" w:styleId="849">
     <w:name w:val="Subtitle Char"/>
-    <w:basedOn w:val="148"/>
-    <w:link w:val="161"/>
+    <w:basedOn w:val="836"/>
+    <w:link w:val="848"/>
     <w:uiPriority w:val="11"/>
     <w:pPr>
       <w:pBdr/>
@@ -30546,11 +31209,11 @@
       <w:szCs w:val="28"/>
     </w:rPr>
   </w:style>
-  <w:style w:type="paragraph" w:styleId="163">
+  <w:style w:type="paragraph" w:styleId="850">
     <w:name w:val="Quote"/>
-    <w:basedOn w:val="664"/>
-    <w:next w:val="664"/>
-    <w:link w:val="164"/>
+    <w:basedOn w:val="886"/>
+    <w:next w:val="886"/>
+    <w:link w:val="851"/>
     <w:uiPriority w:val="29"/>
     <w:qFormat/>
     <w:pPr>
@@ -30565,10 +31228,10 @@
       <w:color w:val="404040" w:themeColor="text1" w:themeTint="BF"/>
     </w:rPr>
   </w:style>
-  <w:style w:type="character" w:styleId="164">
+  <w:style w:type="character" w:styleId="851">
     <w:name w:val="Quote Char"/>
-    <w:basedOn w:val="148"/>
-    <w:link w:val="163"/>
+    <w:basedOn w:val="836"/>
+    <w:link w:val="850"/>
     <w:uiPriority w:val="29"/>
     <w:pPr>
       <w:pBdr/>
@@ -30581,9 +31244,9 @@
       <w:color w:val="404040" w:themeColor="text1" w:themeTint="BF"/>
     </w:rPr>
   </w:style>
-  <w:style w:type="character" w:styleId="166">
+  <w:style w:type="character" w:styleId="852">
     <w:name w:val="Intense Emphasis"/>
-    <w:basedOn w:val="148"/>
+    <w:basedOn w:val="836"/>
     <w:uiPriority w:val="21"/>
     <w:qFormat/>
     <w:pPr>
@@ -30597,11 +31260,11 @@
       <w:color w:val="0f4761" w:themeColor="accent1" w:themeShade="BF"/>
     </w:rPr>
   </w:style>
-  <w:style w:type="paragraph" w:styleId="167">
+  <w:style w:type="paragraph" w:styleId="853">
     <w:name w:val="Intense Quote"/>
-    <w:basedOn w:val="664"/>
-    <w:next w:val="664"/>
-    <w:link w:val="168"/>
+    <w:basedOn w:val="886"/>
+    <w:next w:val="886"/>
+    <w:link w:val="854"/>
     <w:uiPriority w:val="30"/>
     <w:qFormat/>
     <w:pPr>
@@ -30619,10 +31282,10 @@
       <w:color w:val="0f4761" w:themeColor="accent1" w:themeShade="BF"/>
     </w:rPr>
   </w:style>
-  <w:style w:type="character" w:styleId="168">
+  <w:style w:type="character" w:styleId="854">
     <w:name w:val="Intense Quote Char"/>
-    <w:basedOn w:val="148"/>
-    <w:link w:val="167"/>
+    <w:basedOn w:val="836"/>
+    <w:link w:val="853"/>
     <w:uiPriority w:val="30"/>
     <w:pPr>
       <w:pBdr/>
@@ -30635,9 +31298,9 @@
       <w:color w:val="0f4761" w:themeColor="accent1" w:themeShade="BF"/>
     </w:rPr>
   </w:style>
-  <w:style w:type="character" w:styleId="169">
+  <w:style w:type="character" w:styleId="855">
     <w:name w:val="Intense Reference"/>
-    <w:basedOn w:val="148"/>
+    <w:basedOn w:val="836"/>
     <w:uiPriority w:val="32"/>
     <w:qFormat/>
     <w:pPr>
@@ -30653,9 +31316,9 @@
       <w:spacing w:val="5"/>
     </w:rPr>
   </w:style>
-  <w:style w:type="character" w:styleId="171">
+  <w:style w:type="character" w:styleId="856">
     <w:name w:val="Subtle Emphasis"/>
-    <w:basedOn w:val="148"/>
+    <w:basedOn w:val="836"/>
     <w:uiPriority w:val="19"/>
     <w:qFormat/>
     <w:pPr>
@@ -30669,9 +31332,9 @@
       <w:color w:val="404040" w:themeColor="text1" w:themeTint="BF"/>
     </w:rPr>
   </w:style>
-  <w:style w:type="character" w:styleId="172">
+  <w:style w:type="character" w:styleId="857">
     <w:name w:val="Emphasis"/>
-    <w:basedOn w:val="148"/>
+    <w:basedOn w:val="836"/>
     <w:uiPriority w:val="20"/>
     <w:qFormat/>
     <w:pPr>
@@ -30684,9 +31347,9 @@
       <w:iCs/>
     </w:rPr>
   </w:style>
-  <w:style w:type="character" w:styleId="173">
+  <w:style w:type="character" w:styleId="858">
     <w:name w:val="Strong"/>
-    <w:basedOn w:val="148"/>
+    <w:basedOn w:val="836"/>
     <w:uiPriority w:val="22"/>
     <w:qFormat/>
     <w:pPr>
@@ -30699,9 +31362,9 @@
       <w:bCs/>
     </w:rPr>
   </w:style>
-  <w:style w:type="character" w:styleId="174">
+  <w:style w:type="character" w:styleId="859">
     <w:name w:val="Subtle Reference"/>
-    <w:basedOn w:val="148"/>
+    <w:basedOn w:val="836"/>
     <w:uiPriority w:val="31"/>
     <w:qFormat/>
     <w:pPr>
@@ -30714,9 +31377,9 @@
       <w:color w:val="5a5a5a" w:themeColor="text1" w:themeTint="A5"/>
     </w:rPr>
   </w:style>
-  <w:style w:type="character" w:styleId="175">
+  <w:style w:type="character" w:styleId="860">
     <w:name w:val="Book Title"/>
-    <w:basedOn w:val="148"/>
+    <w:basedOn w:val="836"/>
     <w:uiPriority w:val="33"/>
     <w:qFormat/>
     <w:pPr>
@@ -30732,10 +31395,10 @@
       <w:spacing w:val="5"/>
     </w:rPr>
   </w:style>
-  <w:style w:type="paragraph" w:styleId="176">
+  <w:style w:type="paragraph" w:styleId="861">
     <w:name w:val="Header"/>
-    <w:basedOn w:val="664"/>
-    <w:link w:val="177"/>
+    <w:basedOn w:val="886"/>
+    <w:link w:val="862"/>
     <w:uiPriority w:val="99"/>
     <w:unhideWhenUsed/>
     <w:pPr>
@@ -30748,10 +31411,10 @@
       <w:ind/>
     </w:pPr>
   </w:style>
-  <w:style w:type="character" w:styleId="177">
+  <w:style w:type="character" w:styleId="862">
     <w:name w:val="Header Char"/>
-    <w:basedOn w:val="148"/>
-    <w:link w:val="176"/>
+    <w:basedOn w:val="836"/>
+    <w:link w:val="861"/>
     <w:uiPriority w:val="99"/>
     <w:pPr>
       <w:pBdr/>
@@ -30759,10 +31422,10 @@
       <w:ind/>
     </w:pPr>
   </w:style>
-  <w:style w:type="paragraph" w:styleId="178">
+  <w:style w:type="paragraph" w:styleId="863">
     <w:name w:val="Footer"/>
-    <w:basedOn w:val="664"/>
-    <w:link w:val="179"/>
+    <w:basedOn w:val="886"/>
+    <w:link w:val="864"/>
     <w:uiPriority w:val="99"/>
     <w:unhideWhenUsed/>
     <w:pPr>
@@ -30775,10 +31438,10 @@
       <w:ind/>
     </w:pPr>
   </w:style>
-  <w:style w:type="character" w:styleId="179">
+  <w:style w:type="character" w:styleId="864">
     <w:name w:val="Footer Char"/>
-    <w:basedOn w:val="148"/>
-    <w:link w:val="178"/>
+    <w:basedOn w:val="836"/>
+    <w:link w:val="863"/>
     <w:uiPriority w:val="99"/>
     <w:pPr>
       <w:pBdr/>
@@ -30786,10 +31449,10 @@
       <w:ind/>
     </w:pPr>
   </w:style>
-  <w:style w:type="paragraph" w:styleId="180">
+  <w:style w:type="paragraph" w:styleId="865">
     <w:name w:val="Caption"/>
-    <w:basedOn w:val="664"/>
-    <w:next w:val="664"/>
+    <w:basedOn w:val="886"/>
+    <w:next w:val="886"/>
     <w:uiPriority w:val="35"/>
     <w:unhideWhenUsed/>
     <w:qFormat/>
@@ -30806,10 +31469,10 @@
       <w:szCs w:val="18"/>
     </w:rPr>
   </w:style>
-  <w:style w:type="paragraph" w:styleId="181">
+  <w:style w:type="paragraph" w:styleId="866">
     <w:name w:val="footnote text"/>
-    <w:basedOn w:val="664"/>
-    <w:link w:val="182"/>
+    <w:basedOn w:val="886"/>
+    <w:link w:val="867"/>
     <w:uiPriority w:val="99"/>
     <w:semiHidden/>
     <w:unhideWhenUsed/>
@@ -30823,10 +31486,10 @@
       <w:szCs w:val="20"/>
     </w:rPr>
   </w:style>
-  <w:style w:type="character" w:styleId="182">
+  <w:style w:type="character" w:styleId="867">
     <w:name w:val="Footnote Text Char"/>
-    <w:basedOn w:val="148"/>
-    <w:link w:val="181"/>
+    <w:basedOn w:val="836"/>
+    <w:link w:val="866"/>
     <w:uiPriority w:val="99"/>
     <w:semiHidden/>
     <w:pPr>
@@ -30839,9 +31502,9 @@
       <w:szCs w:val="20"/>
     </w:rPr>
   </w:style>
-  <w:style w:type="character" w:styleId="183">
+  <w:style w:type="character" w:styleId="868">
     <w:name w:val="footnote reference"/>
-    <w:basedOn w:val="148"/>
+    <w:basedOn w:val="836"/>
     <w:uiPriority w:val="99"/>
     <w:semiHidden/>
     <w:unhideWhenUsed/>
@@ -30854,10 +31517,10 @@
       <w:vertAlign w:val="superscript"/>
     </w:rPr>
   </w:style>
-  <w:style w:type="paragraph" w:styleId="184">
+  <w:style w:type="paragraph" w:styleId="869">
     <w:name w:val="endnote text"/>
-    <w:basedOn w:val="664"/>
-    <w:link w:val="185"/>
+    <w:basedOn w:val="886"/>
+    <w:link w:val="870"/>
     <w:uiPriority w:val="99"/>
     <w:semiHidden/>
     <w:unhideWhenUsed/>
@@ -30871,10 +31534,10 @@
       <w:szCs w:val="20"/>
     </w:rPr>
   </w:style>
-  <w:style w:type="character" w:styleId="185">
+  <w:style w:type="character" w:styleId="870">
     <w:name w:val="Endnote Text Char"/>
-    <w:basedOn w:val="148"/>
-    <w:link w:val="184"/>
+    <w:basedOn w:val="836"/>
+    <w:link w:val="869"/>
     <w:uiPriority w:val="99"/>
     <w:semiHidden/>
     <w:pPr>
@@ -30887,9 +31550,9 @@
       <w:szCs w:val="20"/>
     </w:rPr>
   </w:style>
-  <w:style w:type="character" w:styleId="186">
+  <w:style w:type="character" w:styleId="871">
     <w:name w:val="endnote reference"/>
-    <w:basedOn w:val="148"/>
+    <w:basedOn w:val="836"/>
     <w:uiPriority w:val="99"/>
     <w:semiHidden/>
     <w:unhideWhenUsed/>
@@ -30902,9 +31565,9 @@
       <w:vertAlign w:val="superscript"/>
     </w:rPr>
   </w:style>
-  <w:style w:type="character" w:styleId="187">
+  <w:style w:type="character" w:styleId="872">
     <w:name w:val="Hyperlink"/>
-    <w:basedOn w:val="148"/>
+    <w:basedOn w:val="836"/>
     <w:uiPriority w:val="99"/>
     <w:unhideWhenUsed/>
     <w:pPr>
@@ -30917,9 +31580,9 @@
       <w:u w:val="single"/>
     </w:rPr>
   </w:style>
-  <w:style w:type="character" w:styleId="188">
+  <w:style w:type="character" w:styleId="873">
     <w:name w:val="FollowedHyperlink"/>
-    <w:basedOn w:val="148"/>
+    <w:basedOn w:val="836"/>
     <w:uiPriority w:val="99"/>
     <w:semiHidden/>
     <w:unhideWhenUsed/>
@@ -30933,10 +31596,10 @@
       <w:u w:val="single"/>
     </w:rPr>
   </w:style>
-  <w:style w:type="paragraph" w:styleId="189">
+  <w:style w:type="paragraph" w:styleId="874">
     <w:name w:val="toc 1"/>
-    <w:basedOn w:val="664"/>
-    <w:next w:val="664"/>
+    <w:basedOn w:val="886"/>
+    <w:next w:val="886"/>
     <w:uiPriority w:val="39"/>
     <w:unhideWhenUsed/>
     <w:pPr>
@@ -30945,10 +31608,10 @@
       <w:ind/>
     </w:pPr>
   </w:style>
-  <w:style w:type="paragraph" w:styleId="190">
+  <w:style w:type="paragraph" w:styleId="875">
     <w:name w:val="toc 2"/>
-    <w:basedOn w:val="664"/>
-    <w:next w:val="664"/>
+    <w:basedOn w:val="886"/>
+    <w:next w:val="886"/>
     <w:uiPriority w:val="39"/>
     <w:unhideWhenUsed/>
     <w:pPr>
@@ -30957,10 +31620,10 @@
       <w:ind w:left="220"/>
     </w:pPr>
   </w:style>
-  <w:style w:type="paragraph" w:styleId="191">
+  <w:style w:type="paragraph" w:styleId="876">
     <w:name w:val="toc 3"/>
-    <w:basedOn w:val="664"/>
-    <w:next w:val="664"/>
+    <w:basedOn w:val="886"/>
+    <w:next w:val="886"/>
     <w:uiPriority w:val="39"/>
     <w:unhideWhenUsed/>
     <w:pPr>
@@ -30969,10 +31632,10 @@
       <w:ind w:left="440"/>
     </w:pPr>
   </w:style>
-  <w:style w:type="paragraph" w:styleId="192">
+  <w:style w:type="paragraph" w:styleId="877">
     <w:name w:val="toc 4"/>
-    <w:basedOn w:val="664"/>
-    <w:next w:val="664"/>
+    <w:basedOn w:val="886"/>
+    <w:next w:val="886"/>
     <w:uiPriority w:val="39"/>
     <w:unhideWhenUsed/>
     <w:pPr>
@@ -30981,10 +31644,10 @@
       <w:ind w:left="660"/>
     </w:pPr>
   </w:style>
-  <w:style w:type="paragraph" w:styleId="193">
+  <w:style w:type="paragraph" w:styleId="878">
     <w:name w:val="toc 5"/>
-    <w:basedOn w:val="664"/>
-    <w:next w:val="664"/>
+    <w:basedOn w:val="886"/>
+    <w:next w:val="886"/>
     <w:uiPriority w:val="39"/>
     <w:unhideWhenUsed/>
     <w:pPr>
@@ -30993,10 +31656,10 @@
       <w:ind w:left="880"/>
     </w:pPr>
   </w:style>
-  <w:style w:type="paragraph" w:styleId="194">
+  <w:style w:type="paragraph" w:styleId="879">
     <w:name w:val="toc 6"/>
-    <w:basedOn w:val="664"/>
-    <w:next w:val="664"/>
+    <w:basedOn w:val="886"/>
+    <w:next w:val="886"/>
     <w:uiPriority w:val="39"/>
     <w:unhideWhenUsed/>
     <w:pPr>
@@ -31005,10 +31668,10 @@
       <w:ind w:left="1100"/>
     </w:pPr>
   </w:style>
-  <w:style w:type="paragraph" w:styleId="195">
+  <w:style w:type="paragraph" w:styleId="880">
     <w:name w:val="toc 7"/>
-    <w:basedOn w:val="664"/>
-    <w:next w:val="664"/>
+    <w:basedOn w:val="886"/>
+    <w:next w:val="886"/>
     <w:uiPriority w:val="39"/>
     <w:unhideWhenUsed/>
     <w:pPr>
@@ -31017,10 +31680,10 @@
       <w:ind w:left="1320"/>
     </w:pPr>
   </w:style>
-  <w:style w:type="paragraph" w:styleId="196">
+  <w:style w:type="paragraph" w:styleId="881">
     <w:name w:val="toc 8"/>
-    <w:basedOn w:val="664"/>
-    <w:next w:val="664"/>
+    <w:basedOn w:val="886"/>
+    <w:next w:val="886"/>
     <w:uiPriority w:val="39"/>
     <w:unhideWhenUsed/>
     <w:pPr>
@@ -31029,10 +31692,10 @@
       <w:ind w:left="1540"/>
     </w:pPr>
   </w:style>
-  <w:style w:type="paragraph" w:styleId="197">
+  <w:style w:type="paragraph" w:styleId="882">
     <w:name w:val="toc 9"/>
-    <w:basedOn w:val="664"/>
-    <w:next w:val="664"/>
+    <w:basedOn w:val="886"/>
+    <w:next w:val="886"/>
     <w:uiPriority w:val="39"/>
     <w:unhideWhenUsed/>
     <w:pPr>
@@ -31041,9 +31704,9 @@
       <w:ind w:left="1760"/>
     </w:pPr>
   </w:style>
-  <w:style w:type="character" w:styleId="198">
+  <w:style w:type="character" w:styleId="883">
     <w:name w:val="Placeholder Text"/>
-    <w:basedOn w:val="148"/>
+    <w:basedOn w:val="836"/>
     <w:uiPriority w:val="99"/>
     <w:semiHidden/>
     <w:pPr>
@@ -31055,7 +31718,7 @@
       <w:color w:val="666666"/>
     </w:rPr>
   </w:style>
-  <w:style w:type="paragraph" w:styleId="208">
+  <w:style w:type="paragraph" w:styleId="884">
     <w:name w:val="TOC Heading"/>
     <w:uiPriority w:val="39"/>
     <w:unhideWhenUsed/>
@@ -31065,10 +31728,10 @@
       <w:ind/>
     </w:pPr>
   </w:style>
-  <w:style w:type="paragraph" w:styleId="209">
+  <w:style w:type="paragraph" w:styleId="885">
     <w:name w:val="table of figures"/>
-    <w:basedOn w:val="664"/>
-    <w:next w:val="664"/>
+    <w:basedOn w:val="886"/>
+    <w:next w:val="886"/>
     <w:uiPriority w:val="99"/>
     <w:unhideWhenUsed/>
     <w:pPr>
@@ -31077,7 +31740,7 @@
       <w:ind/>
     </w:pPr>
   </w:style>
-  <w:style w:type="paragraph" w:styleId="664" w:default="1">
+  <w:style w:type="paragraph" w:styleId="886" w:default="1">
     <w:name w:val="Normal"/>
     <w:qFormat/>
     <w:pPr>
@@ -31086,7 +31749,7 @@
       <w:ind/>
     </w:pPr>
   </w:style>
-  <w:style w:type="table" w:styleId="665" w:default="1">
+  <w:style w:type="table" w:styleId="887" w:default="1">
     <w:name w:val="Normal Table"/>
     <w:uiPriority w:val="99"/>
     <w:semiHidden/>
@@ -31279,7 +31942,7 @@
       </w:tcPr>
     </w:tblStylePr>
   </w:style>
-  <w:style w:type="numbering" w:styleId="666" w:default="1">
+  <w:style w:type="numbering" w:styleId="888" w:default="1">
     <w:name w:val="No List"/>
     <w:uiPriority w:val="99"/>
     <w:semiHidden/>
@@ -31290,9 +31953,9 @@
       <w:ind/>
     </w:pPr>
   </w:style>
-  <w:style w:type="paragraph" w:styleId="667">
+  <w:style w:type="paragraph" w:styleId="889">
     <w:name w:val="No Spacing"/>
-    <w:basedOn w:val="664"/>
+    <w:basedOn w:val="886"/>
     <w:uiPriority w:val="1"/>
     <w:qFormat/>
     <w:pPr>
@@ -31301,9 +31964,9 @@
       <w:ind/>
     </w:pPr>
   </w:style>
-  <w:style w:type="paragraph" w:styleId="668">
+  <w:style w:type="paragraph" w:styleId="890">
     <w:name w:val="List Paragraph"/>
-    <w:basedOn w:val="664"/>
+    <w:basedOn w:val="886"/>
     <w:uiPriority w:val="34"/>
     <w:qFormat/>
     <w:pPr>

</xml_diff>